<commit_message>
Update protocol publication documents
</commit_message>
<xml_diff>
--- a/protocol-publication/RR_27112025_MK_PK_edits_JK_SR.docx
+++ b/protocol-publication/RR_27112025_MK_PK_edits_JK_SR.docx
@@ -400,26 +400,15 @@
       <w:r>
         <w:t xml:space="preserve">Deaths are confirmed through verification of hospital records. For outcome assessments such as EQ-5D, WHODAS, and return-to-work status, the CRC makes regular follow-up calls to obtain updates from the participant or their nearest kin. </w:t>
       </w:r>
-      <w:ins w:id="5" w:author="sranjan@masonlive.gmu.edu" w:date="2025-12-05T16:37:00Z">
-        <w:r>
-          <w:t xml:space="preserve">By Day 30, at least three to four phone calls </w:t>
-        </w:r>
-      </w:ins>
-      <w:ins w:id="6" w:author="sranjan@masonlive.gmu.edu" w:date="2025-12-05T16:37:00Z" w16du:dateUtc="2025-12-05T21:37:00Z">
-        <w:r>
-          <w:t>a</w:t>
-        </w:r>
-      </w:ins>
-      <w:ins w:id="7" w:author="sranjan@masonlive.gmu.edu" w:date="2025-12-05T16:38:00Z" w16du:dateUtc="2025-12-05T21:38:00Z">
-        <w:r>
-          <w:t>re</w:t>
-        </w:r>
-      </w:ins>
-      <w:ins w:id="8" w:author="sranjan@masonlive.gmu.edu" w:date="2025-12-05T16:37:00Z">
-        <w:r>
-          <w:t xml:space="preserve"> attempted. Depending on the response, a subsequent telephone follow-up will be scheduled. </w:t>
-        </w:r>
-      </w:ins>
+      <w:r>
+        <w:t xml:space="preserve">By Day 30, at least three to four phone calls </w:t>
+      </w:r>
+      <w:r>
+        <w:t>are</w:t>
+      </w:r>
+      <w:r>
+        <w:t xml:space="preserve"> attempted. Depending on the response, a subsequent telephone follow-up will be scheduled. </w:t>
+      </w:r>
       <w:r>
         <w:t>In cases where no contact can be established despite repeated attempts, the participant is classified as a loss to follow-up.</w:t>
       </w:r>
@@ -438,12 +427,12 @@
       <w:r>
         <w:t xml:space="preserve"> </w:t>
       </w:r>
-      <w:commentRangeStart w:id="9"/>
-      <w:commentRangeStart w:id="10"/>
+      <w:commentRangeStart w:id="5"/>
+      <w:commentRangeStart w:id="6"/>
       <w:r>
         <w:t>Prespecify how you will handle deaths that cannot be confirmed at 30 days (e.g., treat as alive, treat as missing — and how this choice will be handled in sensitivity analyses). Add an analysis plan for differential loss to follow-up (e.g., inverse-probability weighting or worst-case/best-case sensitivity analyses).</w:t>
       </w:r>
-      <w:commentRangeEnd w:id="9"/>
+      <w:commentRangeEnd w:id="5"/>
       <w:r>
         <w:rPr>
           <w:rStyle w:val="CommentReference"/>
@@ -454,14 +443,14 @@
           <w:lang w:val="en-US" w:eastAsia="en-US"/>
           <w14:ligatures w14:val="standardContextual"/>
         </w:rPr>
-        <w:commentReference w:id="9"/>
-      </w:r>
-      <w:commentRangeEnd w:id="10"/>
+        <w:commentReference w:id="5"/>
+      </w:r>
+      <w:commentRangeEnd w:id="6"/>
       <w:r>
         <w:rPr>
           <w:rStyle w:val="CommentReference"/>
         </w:rPr>
-        <w:commentReference w:id="10"/>
+        <w:commentReference w:id="6"/>
       </w:r>
     </w:p>
     <w:p>
@@ -476,22 +465,28 @@
         <w:t xml:space="preserve">R2.3 </w:t>
       </w:r>
       <w:r>
-        <w:t>Deaths that cannot be confirmed at 30 days will be treated as missing. We will handle missing data in the primary outcome depending on the amount of missing. If there is less than 10% missingness in the primary outcome, then we will conduct a complete case analysis. If there is more than 10% missingness then we will use multiple imputation, unless we have reason to believe that the data may be missing not at random. We have clarified this in the manuscript, item 12 and 20c.</w:t>
-      </w:r>
-    </w:p>
-    <w:p>
-      <w:pPr>
-        <w:pStyle w:val="NormalWeb"/>
-      </w:pPr>
+        <w:t>In-hospital mortality is unlikely to be missing. Patients who are discharged alive before day 30 will be considered alive. For all-cause mortality at 30 days and beyond, d</w:t>
+      </w:r>
+      <w:r>
+        <w:t xml:space="preserve">eaths that cannot be confirmed will be treated as missing. We will handle missing data in the primary outcome depending on the amount of missing. If there is less than 10% missingness in the primary outcome, then we will conduct a complete case analysis. If there is more than 10% missingness then we will use multiple imputation, unless we have reason to believe that the </w:t>
+      </w:r>
       <w:r>
         <w:lastRenderedPageBreak/>
+        <w:t>data may be missing not at random. We have clarified this in the manuscript, item 12 and 20c.</w:t>
+      </w:r>
+    </w:p>
+    <w:p>
+      <w:pPr>
+        <w:pStyle w:val="NormalWeb"/>
+      </w:pPr>
+      <w:r>
         <w:t xml:space="preserve">2) </w:t>
       </w:r>
-      <w:commentRangeStart w:id="11"/>
+      <w:commentRangeStart w:id="7"/>
       <w:r>
         <w:t>Blinding and outcome assessment bias</w:t>
       </w:r>
-      <w:commentRangeEnd w:id="11"/>
+      <w:commentRangeEnd w:id="7"/>
       <w:r>
         <w:rPr>
           <w:rStyle w:val="CommentReference"/>
@@ -502,7 +497,7 @@
           <w:lang w:val="en-US" w:eastAsia="en-US"/>
           <w14:ligatures w14:val="standardContextual"/>
         </w:rPr>
-        <w:commentReference w:id="11"/>
+        <w:commentReference w:id="7"/>
       </w:r>
     </w:p>
     <w:p>
@@ -543,266 +538,212 @@
       <w:pPr>
         <w:pStyle w:val="NormalWeb"/>
       </w:pPr>
-      <w:commentRangeStart w:id="12"/>
+      <w:commentRangeStart w:id="8"/>
+      <w:commentRangeStart w:id="9"/>
+      <w:commentRangeStart w:id="10"/>
+      <w:r>
+        <w:rPr>
+          <w:b/>
+          <w:bCs/>
+        </w:rPr>
+        <w:t xml:space="preserve">R2.4 </w:t>
+      </w:r>
+      <w:r>
+        <w:rPr>
+          <w:rPrChange w:id="11" w:author="sranjan@masonlive.gmu.edu" w:date="2025-12-05T16:42:00Z" w16du:dateUtc="2025-12-05T21:42:00Z">
+            <w:rPr>
+              <w:b/>
+              <w:bCs/>
+            </w:rPr>
+          </w:rPrChange>
+        </w:rPr>
+        <w:t xml:space="preserve">In case death occurs in the hospital, </w:t>
+      </w:r>
+      <w:r>
+        <w:t xml:space="preserve">a hundred </w:t>
+      </w:r>
+      <w:r>
+        <w:t xml:space="preserve">percent </w:t>
+      </w:r>
+      <w:r>
+        <w:t>review</w:t>
+      </w:r>
+      <w:r>
+        <w:t xml:space="preserve"> of the </w:t>
+      </w:r>
+      <w:r>
+        <w:rPr>
+          <w:rPrChange w:id="12" w:author="sranjan@masonlive.gmu.edu" w:date="2025-12-05T16:42:00Z" w16du:dateUtc="2025-12-05T21:42:00Z">
+            <w:rPr>
+              <w:b/>
+              <w:bCs/>
+            </w:rPr>
+          </w:rPrChange>
+        </w:rPr>
+        <w:t>source data</w:t>
+      </w:r>
+      <w:r>
+        <w:t xml:space="preserve"> is done through onsite and remote monitoring</w:t>
+      </w:r>
+      <w:r>
+        <w:t>. This has been clarified in the manuscript, item 18a.</w:t>
+      </w:r>
+      <w:commentRangeEnd w:id="8"/>
+      <w:r>
+        <w:rPr>
+          <w:rStyle w:val="CommentReference"/>
+        </w:rPr>
+        <w:commentReference w:id="8"/>
+      </w:r>
+      <w:commentRangeEnd w:id="9"/>
+      <w:r>
+        <w:rPr>
+          <w:rStyle w:val="CommentReference"/>
+        </w:rPr>
+        <w:commentReference w:id="9"/>
+      </w:r>
+      <w:commentRangeEnd w:id="10"/>
+      <w:r>
+        <w:rPr>
+          <w:rStyle w:val="CommentReference"/>
+        </w:rPr>
+        <w:commentReference w:id="10"/>
+      </w:r>
+    </w:p>
+    <w:p>
+      <w:pPr>
+        <w:pStyle w:val="NormalWeb"/>
+      </w:pPr>
+      <w:r>
+        <w:rPr>
+          <w:b/>
+          <w:bCs/>
+        </w:rPr>
+        <w:t>Q2.5</w:t>
+      </w:r>
+      <w:r>
+        <w:t xml:space="preserve"> </w:t>
+      </w:r>
+      <w:r>
+        <w:t xml:space="preserve">For outcomes subject to ascertainment (ICU admission, length of stay), describe standardised, </w:t>
+      </w:r>
       <w:commentRangeStart w:id="13"/>
+      <w:r>
+        <w:t xml:space="preserve">objective definitions </w:t>
+      </w:r>
+      <w:commentRangeEnd w:id="13"/>
+      <w:r>
+        <w:rPr>
+          <w:rStyle w:val="CommentReference"/>
+        </w:rPr>
+        <w:commentReference w:id="13"/>
+      </w:r>
+      <w:r>
+        <w:t>and whether any central adjudication will occur.</w:t>
+      </w:r>
+    </w:p>
+    <w:p>
+      <w:pPr>
+        <w:pStyle w:val="NormalWeb"/>
+      </w:pPr>
+      <w:r>
+        <w:rPr>
+          <w:b/>
+          <w:bCs/>
+        </w:rPr>
+        <w:t xml:space="preserve">R2.5 </w:t>
+      </w:r>
+      <w:r>
+        <w:t>See R2.4.</w:t>
+      </w:r>
+      <w:r>
+        <w:t xml:space="preserve"> In addition, ICU admission and length of stay are defined and a</w:t>
+      </w:r>
+      <w:r>
+        <w:t>vailable from the medical records.</w:t>
+      </w:r>
+    </w:p>
+    <w:p>
+      <w:pPr>
+        <w:pStyle w:val="NormalWeb"/>
+      </w:pPr>
+      <w:r>
+        <w:rPr>
+          <w:b/>
+          <w:bCs/>
+        </w:rPr>
+        <w:t>Q2.</w:t>
+      </w:r>
+      <w:proofErr w:type="gramStart"/>
+      <w:r>
+        <w:rPr>
+          <w:b/>
+          <w:bCs/>
+        </w:rPr>
+        <w:t>6</w:t>
+      </w:r>
+      <w:proofErr w:type="gramEnd"/>
+      <w:r>
+        <w:t xml:space="preserve"> </w:t>
+      </w:r>
+      <w:r>
+        <w:t>If possible, blind the statistician performing the primary analysis to intervention timing (e.g., anonymised period labels) or document why blinding the analyst is infeasible and how you will mitigate bias.</w:t>
+      </w:r>
+    </w:p>
+    <w:p>
+      <w:pPr>
+        <w:pStyle w:val="NormalWeb"/>
+      </w:pPr>
+      <w:r>
+        <w:rPr>
+          <w:b/>
+          <w:bCs/>
+        </w:rPr>
+        <w:t xml:space="preserve">R2.6 </w:t>
+      </w:r>
+      <w:r>
+        <w:t>For stepped wedge trials it is difficult to blind the analysing statistician since treatment and time are related to each other</w:t>
+      </w:r>
+      <w:r>
+        <w:t xml:space="preserve">. </w:t>
+      </w:r>
+      <w:r>
+        <w:t>Instead</w:t>
+      </w:r>
+      <w:r>
+        <w:t xml:space="preserve">, </w:t>
+      </w:r>
+      <w:r>
+        <w:t>to protect against issues to do with an unblinded analysis of the data</w:t>
+      </w:r>
+      <w:r>
+        <w:t>,</w:t>
+      </w:r>
+      <w:r>
+        <w:t xml:space="preserve"> a full statistical analysis plan – including example code and descriptions of all sensitivity analyses – </w:t>
+      </w:r>
+      <w:r>
+        <w:t xml:space="preserve">will </w:t>
+      </w:r>
+      <w:r>
+        <w:t>be published online prior to the statistician receiving any data</w:t>
+      </w:r>
+      <w:r>
+        <w:t>. This has been clarified in item 17a.</w:t>
+      </w:r>
+    </w:p>
+    <w:p>
+      <w:pPr>
+        <w:pStyle w:val="NormalWeb"/>
+      </w:pPr>
+      <w:r>
+        <w:t>3</w:t>
+      </w:r>
       <w:commentRangeStart w:id="14"/>
       <w:r>
-        <w:rPr>
-          <w:b/>
-          <w:bCs/>
-        </w:rPr>
-        <w:t xml:space="preserve">R2.4 </w:t>
-      </w:r>
-      <w:ins w:id="15" w:author="sranjan@masonlive.gmu.edu" w:date="2025-12-05T16:42:00Z" w16du:dateUtc="2025-12-05T21:42:00Z">
-        <w:r>
-          <w:rPr>
-            <w:rPrChange w:id="16" w:author="sranjan@masonlive.gmu.edu" w:date="2025-12-05T16:42:00Z" w16du:dateUtc="2025-12-05T21:42:00Z">
-              <w:rPr>
-                <w:b/>
-                <w:bCs/>
-              </w:rPr>
-            </w:rPrChange>
-          </w:rPr>
-          <w:t xml:space="preserve">In case </w:t>
-        </w:r>
-      </w:ins>
-      <w:ins w:id="17" w:author="sranjan@masonlive.gmu.edu" w:date="2025-12-05T16:41:00Z">
-        <w:r>
-          <w:rPr>
-            <w:rPrChange w:id="18" w:author="sranjan@masonlive.gmu.edu" w:date="2025-12-05T16:42:00Z" w16du:dateUtc="2025-12-05T21:42:00Z">
-              <w:rPr>
-                <w:b/>
-                <w:bCs/>
-              </w:rPr>
-            </w:rPrChange>
-          </w:rPr>
-          <w:t xml:space="preserve">death occurs in </w:t>
-        </w:r>
-      </w:ins>
-      <w:ins w:id="19" w:author="sranjan@masonlive.gmu.edu" w:date="2025-12-05T16:42:00Z" w16du:dateUtc="2025-12-05T21:42:00Z">
-        <w:r>
-          <w:rPr>
-            <w:rPrChange w:id="20" w:author="sranjan@masonlive.gmu.edu" w:date="2025-12-05T16:42:00Z" w16du:dateUtc="2025-12-05T21:42:00Z">
-              <w:rPr>
-                <w:b/>
-                <w:bCs/>
-              </w:rPr>
-            </w:rPrChange>
-          </w:rPr>
-          <w:t xml:space="preserve">the </w:t>
-        </w:r>
-      </w:ins>
-      <w:ins w:id="21" w:author="sranjan@masonlive.gmu.edu" w:date="2025-12-05T16:41:00Z">
-        <w:r>
-          <w:rPr>
-            <w:rPrChange w:id="22" w:author="sranjan@masonlive.gmu.edu" w:date="2025-12-05T16:42:00Z" w16du:dateUtc="2025-12-05T21:42:00Z">
-              <w:rPr>
-                <w:b/>
-                <w:bCs/>
-              </w:rPr>
-            </w:rPrChange>
-          </w:rPr>
-          <w:t xml:space="preserve">hospital, </w:t>
-        </w:r>
-      </w:ins>
-      <w:ins w:id="23" w:author="sranjan@masonlive.gmu.edu" w:date="2025-12-05T16:42:00Z" w16du:dateUtc="2025-12-05T21:42:00Z">
-        <w:r>
-          <w:t xml:space="preserve">a hundred </w:t>
-        </w:r>
-      </w:ins>
-      <w:ins w:id="24" w:author="sranjan@masonlive.gmu.edu" w:date="2025-12-05T16:59:00Z" w16du:dateUtc="2025-12-05T21:59:00Z">
-        <w:r>
-          <w:t xml:space="preserve">percent </w:t>
-        </w:r>
-        <w:r>
-          <w:t>review</w:t>
-        </w:r>
-      </w:ins>
-      <w:ins w:id="25" w:author="sranjan@masonlive.gmu.edu" w:date="2025-12-05T16:42:00Z" w16du:dateUtc="2025-12-05T21:42:00Z">
-        <w:r>
-          <w:t xml:space="preserve"> of the </w:t>
-        </w:r>
-      </w:ins>
-      <w:ins w:id="26" w:author="sranjan@masonlive.gmu.edu" w:date="2025-12-05T16:41:00Z">
-        <w:r>
-          <w:rPr>
-            <w:rPrChange w:id="27" w:author="sranjan@masonlive.gmu.edu" w:date="2025-12-05T16:42:00Z" w16du:dateUtc="2025-12-05T21:42:00Z">
-              <w:rPr>
-                <w:b/>
-                <w:bCs/>
-              </w:rPr>
-            </w:rPrChange>
-          </w:rPr>
-          <w:t>source data</w:t>
-        </w:r>
-      </w:ins>
-      <w:ins w:id="28" w:author="sranjan@masonlive.gmu.edu" w:date="2025-12-05T16:42:00Z" w16du:dateUtc="2025-12-05T21:42:00Z">
-        <w:r>
-          <w:t xml:space="preserve"> is done</w:t>
-        </w:r>
-      </w:ins>
-      <w:ins w:id="29" w:author="sranjan@masonlive.gmu.edu" w:date="2025-12-05T16:44:00Z" w16du:dateUtc="2025-12-05T21:44:00Z">
-        <w:r>
-          <w:t xml:space="preserve"> through onsite and remote monitoring</w:t>
-        </w:r>
-      </w:ins>
-      <w:ins w:id="30" w:author="sranjan@masonlive.gmu.edu" w:date="2025-12-05T16:41:00Z">
-        <w:r>
-          <w:rPr>
-            <w:rPrChange w:id="31" w:author="sranjan@masonlive.gmu.edu" w:date="2025-12-05T16:42:00Z" w16du:dateUtc="2025-12-05T21:42:00Z">
-              <w:rPr>
-                <w:b/>
-                <w:bCs/>
-              </w:rPr>
-            </w:rPrChange>
-          </w:rPr>
-          <w:t xml:space="preserve">. If the death happens after discharge, we attempt to determine the cause of mortality. </w:t>
-        </w:r>
-      </w:ins>
-      <w:r>
-        <w:t>Outcome recording will be verified for a sample of observations through remote and on-site monitoring of source data by the coordinating centre. This has been clarified in the manuscript, item 18a.</w:t>
-      </w:r>
-      <w:commentRangeEnd w:id="12"/>
-      <w:r>
-        <w:rPr>
-          <w:rStyle w:val="CommentReference"/>
-        </w:rPr>
-        <w:commentReference w:id="12"/>
-      </w:r>
-      <w:commentRangeEnd w:id="13"/>
-      <w:r>
-        <w:rPr>
-          <w:rStyle w:val="CommentReference"/>
-        </w:rPr>
-        <w:commentReference w:id="13"/>
+        <w:t xml:space="preserve">) Statistical analysis </w:t>
       </w:r>
       <w:commentRangeEnd w:id="14"/>
-      <w:r>
-        <w:rPr>
-          <w:rStyle w:val="CommentReference"/>
-        </w:rPr>
-        <w:commentReference w:id="14"/>
-      </w:r>
-    </w:p>
-    <w:p>
-      <w:pPr>
-        <w:pStyle w:val="NormalWeb"/>
-      </w:pPr>
-      <w:r>
-        <w:rPr>
-          <w:b/>
-          <w:bCs/>
-        </w:rPr>
-        <w:t>Q2.5</w:t>
-      </w:r>
-      <w:r>
-        <w:t xml:space="preserve"> </w:t>
-      </w:r>
-      <w:r>
-        <w:t xml:space="preserve">For outcomes subject to ascertainment (ICU admission, length of stay), describe standardised, </w:t>
-      </w:r>
-      <w:commentRangeStart w:id="32"/>
-      <w:r>
-        <w:t xml:space="preserve">objective definitions </w:t>
-      </w:r>
-      <w:commentRangeEnd w:id="32"/>
-      <w:r>
-        <w:rPr>
-          <w:rStyle w:val="CommentReference"/>
-        </w:rPr>
-        <w:commentReference w:id="32"/>
-      </w:r>
-      <w:r>
-        <w:t>and whether any central adjudication will occur.</w:t>
-      </w:r>
-    </w:p>
-    <w:p>
-      <w:pPr>
-        <w:pStyle w:val="NormalWeb"/>
-      </w:pPr>
-      <w:r>
-        <w:rPr>
-          <w:b/>
-          <w:bCs/>
-        </w:rPr>
-        <w:t xml:space="preserve">R2.5 </w:t>
-      </w:r>
-      <w:r>
-        <w:t>See R2.4.</w:t>
-      </w:r>
-    </w:p>
-    <w:p>
-      <w:pPr>
-        <w:pStyle w:val="NormalWeb"/>
-      </w:pPr>
-      <w:r>
-        <w:rPr>
-          <w:b/>
-          <w:bCs/>
-        </w:rPr>
-        <w:t>Q2.6</w:t>
-      </w:r>
-      <w:r>
-        <w:t xml:space="preserve"> </w:t>
-      </w:r>
-      <w:r>
-        <w:t>If possible, blind the statistician performing the primary analysis to intervention timing (e.g., anonymised period labels) or document why blinding the analyst is infeasible and how you will mitigate bias.</w:t>
-      </w:r>
-    </w:p>
-    <w:p>
-      <w:pPr>
-        <w:pStyle w:val="NormalWeb"/>
-      </w:pPr>
-      <w:r>
-        <w:rPr>
-          <w:b/>
-          <w:bCs/>
-        </w:rPr>
-        <w:t xml:space="preserve">R2.6 </w:t>
-      </w:r>
-      <w:commentRangeStart w:id="33"/>
-      <w:commentRangeStart w:id="34"/>
-      <w:commentRangeStart w:id="35"/>
-      <w:r>
-        <w:t xml:space="preserve">Would </w:t>
-      </w:r>
-      <w:commentRangeEnd w:id="33"/>
-      <w:r>
-        <w:rPr>
-          <w:rStyle w:val="CommentReference"/>
-        </w:rPr>
-        <w:commentReference w:id="33"/>
-      </w:r>
-      <w:r>
-        <w:t>it be possible to blind the statistician? Won’t allocation be obvious from the data structure?</w:t>
-      </w:r>
-      <w:commentRangeEnd w:id="34"/>
-      <w:r>
-        <w:rPr>
-          <w:rStyle w:val="CommentReference"/>
-        </w:rPr>
-        <w:commentReference w:id="34"/>
-      </w:r>
-      <w:commentRangeEnd w:id="35"/>
-      <w:r>
-        <w:rPr>
-          <w:rStyle w:val="CommentReference"/>
-        </w:rPr>
-        <w:commentReference w:id="35"/>
-      </w:r>
-    </w:p>
-    <w:p>
-      <w:pPr>
-        <w:pStyle w:val="NormalWeb"/>
-      </w:pPr>
-      <w:r>
-        <w:t>3</w:t>
-      </w:r>
-      <w:commentRangeStart w:id="36"/>
-      <w:r>
-        <w:t xml:space="preserve">) Statistical analysis </w:t>
-      </w:r>
-      <w:commentRangeEnd w:id="36"/>
       <w:r>
         <w:rPr>
           <w:rStyle w:val="CommentReference"/>
@@ -813,7 +754,7 @@
           <w:lang w:val="en-US" w:eastAsia="en-US"/>
           <w14:ligatures w14:val="standardContextual"/>
         </w:rPr>
-        <w:commentReference w:id="36"/>
+        <w:commentReference w:id="14"/>
       </w:r>
       <w:r>
         <w:t>— small number of clusters and choice of corrections</w:t>
@@ -876,33 +817,52 @@
         <w:t xml:space="preserve">R2.7 </w:t>
       </w:r>
       <w:r>
-        <w:t xml:space="preserve">What small-sample correction method to use is an active area of research, particularly in the context of stepped-wedge and batched stepped-wedge designs. We have therefore decided not to specify the small sample correction that we will use, but instead justify our final choice based on the latest </w:t>
-      </w:r>
-      <w:commentRangeStart w:id="37"/>
-      <w:r>
-        <w:t>literature before patient inclusion has stopped</w:t>
-      </w:r>
-      <w:commentRangeEnd w:id="37"/>
-      <w:r>
-        <w:rPr>
-          <w:rStyle w:val="CommentReference"/>
-        </w:rPr>
-        <w:commentReference w:id="37"/>
-      </w:r>
-      <w:r>
-        <w:t xml:space="preserve">. </w:t>
-      </w:r>
-    </w:p>
-    <w:p>
-      <w:pPr>
-        <w:pStyle w:val="NormalWeb"/>
-      </w:pPr>
-      <w:r>
-        <w:rPr>
-          <w:b/>
-          <w:bCs/>
-        </w:rPr>
+        <w:t>What small-sample correction method to use is an active area of research, particularly in the context of stepped-wedge and batched stepped-wedge designs. We have</w:t>
+      </w:r>
+      <w:r>
+        <w:t xml:space="preserve"> now specified </w:t>
+      </w:r>
+      <w:r>
         <w:lastRenderedPageBreak/>
+        <w:t xml:space="preserve">that we will use </w:t>
+      </w:r>
+      <w:bookmarkStart w:id="15" w:name="_Hlk216065990"/>
+      <w:r>
+        <w:t>a Kenward Roger correction</w:t>
+      </w:r>
+      <w:r>
+        <w:t xml:space="preserve"> </w:t>
+      </w:r>
+      <w:bookmarkEnd w:id="15"/>
+      <w:r>
+        <w:t xml:space="preserve">as our primary </w:t>
+      </w:r>
+      <w:proofErr w:type="gramStart"/>
+      <w:r>
+        <w:t>method, but</w:t>
+      </w:r>
+      <w:proofErr w:type="gramEnd"/>
+      <w:r>
+        <w:t xml:space="preserve"> will potentially update this choice if there </w:t>
+      </w:r>
+      <w:proofErr w:type="gramStart"/>
+      <w:r>
+        <w:t>is</w:t>
+      </w:r>
+      <w:proofErr w:type="gramEnd"/>
+      <w:r>
+        <w:t xml:space="preserve"> new methods work supporting other methods closer to the end of patient inclusion.</w:t>
+      </w:r>
+    </w:p>
+    <w:p>
+      <w:pPr>
+        <w:pStyle w:val="NormalWeb"/>
+      </w:pPr>
+      <w:r>
+        <w:rPr>
+          <w:b/>
+          <w:bCs/>
+        </w:rPr>
         <w:t>Q2.8</w:t>
       </w:r>
       <w:r>
@@ -963,12 +923,12 @@
       <w:pPr>
         <w:pStyle w:val="NormalWeb"/>
       </w:pPr>
-      <w:commentRangeStart w:id="38"/>
-      <w:commentRangeStart w:id="39"/>
+      <w:commentRangeStart w:id="16"/>
+      <w:commentRangeStart w:id="17"/>
       <w:r>
         <w:t>Suggested actions</w:t>
       </w:r>
-      <w:commentRangeEnd w:id="38"/>
+      <w:commentRangeEnd w:id="16"/>
       <w:r>
         <w:rPr>
           <w:rStyle w:val="CommentReference"/>
@@ -979,14 +939,14 @@
           <w:lang w:val="en-US" w:eastAsia="en-US"/>
           <w14:ligatures w14:val="standardContextual"/>
         </w:rPr>
-        <w:commentReference w:id="38"/>
-      </w:r>
-      <w:commentRangeEnd w:id="39"/>
+        <w:commentReference w:id="16"/>
+      </w:r>
+      <w:commentRangeEnd w:id="17"/>
       <w:r>
         <w:rPr>
           <w:rStyle w:val="CommentReference"/>
         </w:rPr>
-        <w:commentReference w:id="39"/>
+        <w:commentReference w:id="17"/>
       </w:r>
       <w:r>
         <w:t>:</w:t>
@@ -1029,7 +989,31 @@
         <w:t xml:space="preserve"> </w:t>
       </w:r>
       <w:r>
-        <w:t>We will conduct the analysis with the time effect modelled using a spline function regardless of whether we think that a strong secular trend is present, thus there is no need to specify thresholds.</w:t>
+        <w:t xml:space="preserve">Period effects will be adjusted for in all </w:t>
+      </w:r>
+      <w:proofErr w:type="gramStart"/>
+      <w:r>
+        <w:t>models</w:t>
+      </w:r>
+      <w:proofErr w:type="gramEnd"/>
+      <w:r>
+        <w:t xml:space="preserve"> and this will account for secular trends.</w:t>
+      </w:r>
+      <w:r>
+        <w:rPr>
+          <w:b/>
+          <w:bCs/>
+        </w:rPr>
+        <w:t xml:space="preserve"> </w:t>
+      </w:r>
+      <w:r>
+        <w:t xml:space="preserve">We will </w:t>
+      </w:r>
+      <w:r>
+        <w:t xml:space="preserve">however </w:t>
+      </w:r>
+      <w:r>
+        <w:t>conduct the analysis with the time effect modelled using a spline function regardless of whether we think that a strong secular trend is present, thus there is no need to specify thresholds.</w:t>
       </w:r>
     </w:p>
     <w:p>
@@ -1064,6 +1048,15 @@
       <w:r>
         <w:t>We will not re-estimate the sample size in the interim analysis, see section 21b. Variable cluster sizes were accounted for in the original sample size calculation, based on data from previous projects.</w:t>
       </w:r>
+      <w:r>
+        <w:t xml:space="preserve"> Also, o</w:t>
+      </w:r>
+      <w:r>
+        <w:t>ur chosen analysis approach (generalised linear mixed models) does not require any explicit consideration of how varying cluster sizes will be accommodated at the analysis stage. Nonetheless, we might anticipate that the intervention effect might differ in smaller vs larger hospitals and so we have therefore added a sub-group analysis in which we will investigate treatment effect heterogeneity by cluster size</w:t>
+      </w:r>
+      <w:r>
+        <w:t xml:space="preserve">, </w:t>
+      </w:r>
     </w:p>
     <w:p>
       <w:pPr>
@@ -1103,11 +1096,15 @@
       <w:r>
         <w:t xml:space="preserve"> </w:t>
       </w:r>
-      <w:commentRangeStart w:id="40"/>
-      <w:r>
-        <w:t>Clarify the exact objectives of the interim review and prespecified quantitative criteria that would trigger stopping (for feasibility) and how the SDMC will make recommendations. If no efficacy stopping is planned, state explicitly. If harm could prompt stopping, set specific thresholds or statistical boundaries (or explain why not applicable).</w:t>
-      </w:r>
-      <w:commentRangeEnd w:id="40"/>
+      <w:commentRangeStart w:id="18"/>
+      <w:r>
+        <w:t xml:space="preserve">Clarify the exact objectives of the interim review and prespecified quantitative criteria that would trigger stopping (for feasibility) and how the SDMC will make recommendations. </w:t>
+      </w:r>
+      <w:r>
+        <w:lastRenderedPageBreak/>
+        <w:t>If no efficacy stopping is planned, state explicitly. If harm could prompt stopping, set specific thresholds or statistical boundaries (or explain why not applicable).</w:t>
+      </w:r>
+      <w:commentRangeEnd w:id="18"/>
       <w:r>
         <w:rPr>
           <w:rStyle w:val="CommentReference"/>
@@ -1118,7 +1115,7 @@
           <w:lang w:val="en-US" w:eastAsia="en-US"/>
           <w14:ligatures w14:val="standardContextual"/>
         </w:rPr>
-        <w:commentReference w:id="40"/>
+        <w:commentReference w:id="18"/>
       </w:r>
     </w:p>
     <w:p>
@@ -1156,7 +1153,6 @@
         <w:pStyle w:val="NormalWeb"/>
       </w:pPr>
       <w:r>
-        <w:lastRenderedPageBreak/>
         <w:t>Issue: The protocol uses opt-out consent for routine data and opt-in for non-routine data; waiver for unconscious patients is also planned. While justified as minimal risk, opt-out and waiver approaches require detailed local justification and documentation.</w:t>
       </w:r>
     </w:p>
@@ -1186,15 +1182,15 @@
         </w:rPr>
         <w:t xml:space="preserve"> </w:t>
       </w:r>
-      <w:commentRangeStart w:id="41"/>
-      <w:commentRangeStart w:id="42"/>
+      <w:commentRangeStart w:id="19"/>
+      <w:commentRangeStart w:id="20"/>
       <w:r>
         <w:rPr>
           <w:color w:val="000000" w:themeColor="text1"/>
         </w:rPr>
         <w:t>Include the exact text (or a summary) of patient information sheets and how opt-out is communicated at arrival (timing, language, signage). State whether local ethics committees approved opt-out/waiver approaches (you indicate approvals but list only 1-2 bodies). Provide the ethical approval reference numbers in the main text.</w:t>
       </w:r>
-      <w:commentRangeEnd w:id="41"/>
+      <w:commentRangeEnd w:id="19"/>
       <w:r>
         <w:rPr>
           <w:rStyle w:val="CommentReference"/>
@@ -1206,9 +1202,9 @@
           <w:lang w:val="en-US" w:eastAsia="en-US"/>
           <w14:ligatures w14:val="standardContextual"/>
         </w:rPr>
-        <w:commentReference w:id="41"/>
-      </w:r>
-      <w:commentRangeEnd w:id="42"/>
+        <w:commentReference w:id="19"/>
+      </w:r>
+      <w:commentRangeEnd w:id="20"/>
       <w:r>
         <w:rPr>
           <w:rStyle w:val="CommentReference"/>
@@ -1220,15 +1216,12 @@
           <w:lang w:val="en-US" w:eastAsia="en-US"/>
           <w14:ligatures w14:val="standardContextual"/>
         </w:rPr>
-        <w:commentReference w:id="42"/>
-      </w:r>
-    </w:p>
-    <w:p>
-      <w:pPr>
-        <w:pStyle w:val="NormalWeb"/>
-        <w:rPr>
-          <w:ins w:id="43" w:author="Prashant Kharat" w:date="2025-11-27T12:21:00Z"/>
-        </w:rPr>
+        <w:commentReference w:id="20"/>
+      </w:r>
+    </w:p>
+    <w:p>
+      <w:pPr>
+        <w:pStyle w:val="NormalWeb"/>
       </w:pPr>
       <w:r>
         <w:rPr>
@@ -1240,46 +1233,52 @@
       <w:r>
         <w:t xml:space="preserve"> </w:t>
       </w:r>
-      <w:commentRangeStart w:id="44"/>
-      <w:ins w:id="45" w:author="sranjan@masonlive.gmu.edu" w:date="2025-11-11T11:36:00Z">
-        <w:r>
-          <w:t>[Add text from consent]</w:t>
-        </w:r>
-      </w:ins>
-      <w:commentRangeEnd w:id="44"/>
-      <w:r>
-        <w:rPr>
-          <w:rStyle w:val="CommentReference"/>
-        </w:rPr>
-        <w:commentReference w:id="44"/>
+      <w:r>
+        <w:t xml:space="preserve">The English text is available below. </w:t>
+      </w:r>
+      <w:r>
+        <w:t>Since the trial is pan India,</w:t>
+      </w:r>
+      <w:r>
+        <w:t xml:space="preserve"> the</w:t>
+      </w:r>
+      <w:r>
+        <w:t xml:space="preserve"> consent form has been translated into the regional languages. </w:t>
+      </w:r>
+      <w:r>
+        <w:t xml:space="preserve">The </w:t>
+      </w:r>
+      <w:r>
+        <w:t>CRC takes the consent in the local languages, which the participants or its relatives are in comfortable with.</w:t>
+      </w:r>
+      <w:r>
+        <w:t xml:space="preserve"> The local ethics committees have approved the consent model.</w:t>
+      </w:r>
+    </w:p>
+    <w:p>
+      <w:pPr>
+        <w:pStyle w:val="NormalWeb"/>
+      </w:pPr>
+      <w:r>
+        <w:t>Text from information sheet:</w:t>
       </w:r>
     </w:p>
     <w:p>
       <w:pPr>
         <w:spacing w:line="276" w:lineRule="auto"/>
         <w:jc w:val="both"/>
-        <w:rPr>
-          <w:ins w:id="46" w:author="Prashant Kharat" w:date="2025-11-27T12:21:00Z"/>
-        </w:rPr>
-      </w:pPr>
-      <w:ins w:id="47" w:author="Prashant Kharat" w:date="2025-11-27T12:21:00Z">
-        <w:r>
-          <w:t>You are invited to participate in a research study. Before deciding to take part, it's important to understand the purpose of this research and what it involves. Please read the following information carefully and feel free to discuss the study with others if you wish. If anything is unclear or if you would like more information, do not hesitate to ask us. Please take your time to decide whether you wish to participate.</w:t>
-        </w:r>
-      </w:ins>
+      </w:pPr>
+      <w:r>
+        <w:t>You are invited to participate in a research study. Before deciding to take part, it's important to understand the purpose of this research and what it involves. Please read the following information carefully and feel free to discuss the study with others if you wish. If anything is unclear or if you would like more information, do not hesitate to ask us. Please take your time to decide whether you wish to participate.</w:t>
+      </w:r>
     </w:p>
     <w:p>
       <w:pPr>
         <w:spacing w:line="276" w:lineRule="auto"/>
-        <w:rPr>
-          <w:ins w:id="48" w:author="Prashant Kharat" w:date="2025-11-27T12:21:00Z"/>
-        </w:rPr>
-      </w:pPr>
-      <w:ins w:id="49" w:author="Prashant Kharat" w:date="2025-11-27T12:21:00Z">
-        <w:r>
-          <w:t>Purpose of the Study and Potential Outcomes</w:t>
-        </w:r>
-      </w:ins>
+      </w:pPr>
+      <w:r>
+        <w:t>Purpose of the Study and Potential Outcomes</w:t>
+      </w:r>
     </w:p>
     <w:p>
       <w:pPr>
@@ -1290,29 +1289,19 @@
         </w:numPr>
         <w:shd w:val="clear" w:color="auto" w:fill="auto"/>
         <w:spacing w:beforeAutospacing="0" w:afterAutospacing="0" w:line="276" w:lineRule="auto"/>
-        <w:rPr>
-          <w:ins w:id="50" w:author="Prashant Kharat" w:date="2025-11-27T12:21:00Z"/>
-        </w:rPr>
-      </w:pPr>
-      <w:ins w:id="51" w:author="Prashant Kharat" w:date="2025-11-27T12:21:00Z">
-        <w:r>
-          <w:t>What is the purpose of the study?</w:t>
-        </w:r>
-      </w:ins>
+      </w:pPr>
+      <w:r>
+        <w:t>What is the purpose of the study?</w:t>
+      </w:r>
     </w:p>
     <w:p>
       <w:pPr>
         <w:spacing w:line="276" w:lineRule="auto"/>
         <w:jc w:val="both"/>
-        <w:rPr>
-          <w:ins w:id="52" w:author="Prashant Kharat" w:date="2025-11-27T12:21:00Z"/>
-        </w:rPr>
-      </w:pPr>
-      <w:ins w:id="53" w:author="Prashant Kharat" w:date="2025-11-27T12:21:00Z">
-        <w:r>
-          <w:t>We are conducting a study at this hospital to determine whether special training, known as Advanced Trauma Life Support (ATLS), provided to doctors, improves the care and outcomes for trauma patients.</w:t>
-        </w:r>
-      </w:ins>
+      </w:pPr>
+      <w:r>
+        <w:t>We are conducting a study at this hospital to determine whether special training, known as Advanced Trauma Life Support (ATLS), provided to doctors, improves the care and outcomes for trauma patients.</w:t>
+      </w:r>
     </w:p>
     <w:p>
       <w:pPr>
@@ -1324,29 +1313,19 @@
         <w:shd w:val="clear" w:color="auto" w:fill="auto"/>
         <w:spacing w:beforeAutospacing="0" w:afterAutospacing="0" w:line="276" w:lineRule="auto"/>
         <w:jc w:val="both"/>
-        <w:rPr>
-          <w:ins w:id="54" w:author="Prashant Kharat" w:date="2025-11-27T12:21:00Z"/>
-        </w:rPr>
-      </w:pPr>
-      <w:ins w:id="55" w:author="Prashant Kharat" w:date="2025-11-27T12:21:00Z">
-        <w:r>
-          <w:t>What does the intervention involve?</w:t>
-        </w:r>
-      </w:ins>
+      </w:pPr>
+      <w:r>
+        <w:t>What does the intervention involve?</w:t>
+      </w:r>
     </w:p>
     <w:p>
       <w:pPr>
         <w:spacing w:line="276" w:lineRule="auto"/>
         <w:jc w:val="both"/>
-        <w:rPr>
-          <w:ins w:id="56" w:author="Prashant Kharat" w:date="2025-11-27T12:21:00Z"/>
-        </w:rPr>
-      </w:pPr>
-      <w:ins w:id="57" w:author="Prashant Kharat" w:date="2025-11-27T12:21:00Z">
-        <w:r>
-          <w:t>You will not receive any direct intervention as part of this study. The intervention consists of a two-and-a-half-day specialized training course for the doctors who will be treating you.</w:t>
-        </w:r>
-      </w:ins>
+      </w:pPr>
+      <w:r>
+        <w:t>You will not receive any direct intervention as part of this study. The intervention consists of a two-and-a-half-day specialized training course for the doctors who will be treating you.</w:t>
+      </w:r>
     </w:p>
     <w:p>
       <w:pPr>
@@ -1358,29 +1337,20 @@
         <w:shd w:val="clear" w:color="auto" w:fill="auto"/>
         <w:spacing w:beforeAutospacing="0" w:afterAutospacing="0" w:line="276" w:lineRule="auto"/>
         <w:jc w:val="both"/>
-        <w:rPr>
-          <w:ins w:id="58" w:author="Prashant Kharat" w:date="2025-11-27T12:21:00Z"/>
-        </w:rPr>
-      </w:pPr>
-      <w:ins w:id="59" w:author="Prashant Kharat" w:date="2025-11-27T12:21:00Z">
-        <w:r>
-          <w:t>Why have I been invited?</w:t>
-        </w:r>
-      </w:ins>
+      </w:pPr>
+      <w:r>
+        <w:t>Why have I been invited?</w:t>
+      </w:r>
     </w:p>
     <w:p>
       <w:pPr>
         <w:spacing w:line="276" w:lineRule="auto"/>
         <w:jc w:val="both"/>
-        <w:rPr>
-          <w:ins w:id="60" w:author="Prashant Kharat" w:date="2025-11-27T12:21:00Z"/>
-        </w:rPr>
-      </w:pPr>
-      <w:ins w:id="61" w:author="Prashant Kharat" w:date="2025-11-27T12:21:00Z">
-        <w:r>
-          <w:t>You have been invited to participate in this study because you were admitted to this hospital after an injury. We plan to include more than 4,000 participants from 30 hospitals across India.</w:t>
-        </w:r>
-      </w:ins>
+      </w:pPr>
+      <w:r>
+        <w:lastRenderedPageBreak/>
+        <w:t>You have been invited to participate in this study because you were admitted to this hospital after an injury. We plan to include more than 4,000 participants from 30 hospitals across India.</w:t>
+      </w:r>
     </w:p>
     <w:p>
       <w:pPr>
@@ -1392,29 +1362,19 @@
         <w:shd w:val="clear" w:color="auto" w:fill="auto"/>
         <w:spacing w:beforeAutospacing="0" w:afterAutospacing="0" w:line="276" w:lineRule="auto"/>
         <w:jc w:val="both"/>
-        <w:rPr>
-          <w:ins w:id="62" w:author="Prashant Kharat" w:date="2025-11-27T12:21:00Z"/>
-        </w:rPr>
-      </w:pPr>
-      <w:ins w:id="63" w:author="Prashant Kharat" w:date="2025-11-27T12:21:00Z">
-        <w:r>
-          <w:t>What will happen if I participate?</w:t>
-        </w:r>
-      </w:ins>
+      </w:pPr>
+      <w:r>
+        <w:t>What will happen if I participate?</w:t>
+      </w:r>
     </w:p>
     <w:p>
       <w:pPr>
         <w:spacing w:line="276" w:lineRule="auto"/>
         <w:jc w:val="both"/>
-        <w:rPr>
-          <w:ins w:id="64" w:author="Prashant Kharat" w:date="2025-11-27T12:21:00Z"/>
-        </w:rPr>
-      </w:pPr>
-      <w:ins w:id="65" w:author="Prashant Kharat" w:date="2025-11-27T12:21:00Z">
-        <w:r>
-          <w:t>During your hospital stay, we will collect certain information required for this study from your routine medical records. This includes your age, gender, medical history, details of your injury, and the treatment you received. During the study's follow-up phase, the hospital research team will:</w:t>
-        </w:r>
-      </w:ins>
+      </w:pPr>
+      <w:r>
+        <w:t>During your hospital stay, we will collect certain information required for this study from your routine medical records. This includes your age, gender, medical history, details of your injury, and the treatment you received. During the study's follow-up phase, the hospital research team will:</w:t>
+      </w:r>
     </w:p>
     <w:p>
       <w:pPr>
@@ -1426,15 +1386,10 @@
         <w:shd w:val="clear" w:color="auto" w:fill="auto"/>
         <w:spacing w:beforeAutospacing="0" w:afterAutospacing="0" w:line="276" w:lineRule="auto"/>
         <w:jc w:val="both"/>
-        <w:rPr>
-          <w:ins w:id="66" w:author="Prashant Kharat" w:date="2025-11-27T12:21:00Z"/>
-        </w:rPr>
-      </w:pPr>
-      <w:ins w:id="67" w:author="Prashant Kharat" w:date="2025-11-27T12:21:00Z">
-        <w:r>
-          <w:t>Call you or a relative one day after your arrival at the hospital to check on your well-being. If you are still in the hospital, we may visit you in the ward.</w:t>
-        </w:r>
-      </w:ins>
+      </w:pPr>
+      <w:r>
+        <w:t>Call you or a relative one day after your arrival at the hospital to check on your well-being. If you are still in the hospital, we may visit you in the ward.</w:t>
+      </w:r>
     </w:p>
     <w:p>
       <w:pPr>
@@ -1446,16 +1401,10 @@
         <w:shd w:val="clear" w:color="auto" w:fill="auto"/>
         <w:spacing w:beforeAutospacing="0" w:afterAutospacing="0" w:line="276" w:lineRule="auto"/>
         <w:jc w:val="both"/>
-        <w:rPr>
-          <w:ins w:id="68" w:author="Prashant Kharat" w:date="2025-11-27T12:21:00Z"/>
-        </w:rPr>
-      </w:pPr>
-      <w:ins w:id="69" w:author="Prashant Kharat" w:date="2025-11-27T12:21:00Z">
-        <w:r>
-          <w:lastRenderedPageBreak/>
-          <w:t>Call you or a relative 30 days after your arrival to check on your well-being. We may visit if you are still in the hospital.</w:t>
-        </w:r>
-      </w:ins>
+      </w:pPr>
+      <w:r>
+        <w:t>Call you or a relative 30 days after your arrival to check on your well-being. We may visit if you are still in the hospital.</w:t>
+      </w:r>
     </w:p>
     <w:p>
       <w:pPr>
@@ -1467,15 +1416,10 @@
         <w:shd w:val="clear" w:color="auto" w:fill="auto"/>
         <w:spacing w:beforeAutospacing="0" w:afterAutospacing="0" w:line="276" w:lineRule="auto"/>
         <w:jc w:val="both"/>
-        <w:rPr>
-          <w:ins w:id="70" w:author="Prashant Kharat" w:date="2025-11-27T12:21:00Z"/>
-        </w:rPr>
-      </w:pPr>
-      <w:ins w:id="71" w:author="Prashant Kharat" w:date="2025-11-27T12:21:00Z">
-        <w:r>
-          <w:t>Call you or a relative three months (90 days) after your arrival to check on your well-being. If you are still in the hospital, we may visit you in the ward. During this time, we may also conduct a short interview, lasting less than five minutes, to inquire about your health status.</w:t>
-        </w:r>
-      </w:ins>
+      </w:pPr>
+      <w:r>
+        <w:t>Call you or a relative three months (90 days) after your arrival to check on your well-being. If you are still in the hospital, we may visit you in the ward. During this time, we may also conduct a short interview, lasting less than five minutes, to inquire about your health status.</w:t>
+      </w:r>
     </w:p>
     <w:p>
       <w:pPr>
@@ -1487,29 +1431,19 @@
         <w:shd w:val="clear" w:color="auto" w:fill="auto"/>
         <w:spacing w:beforeAutospacing="0" w:afterAutospacing="0" w:line="276" w:lineRule="auto"/>
         <w:jc w:val="both"/>
-        <w:rPr>
-          <w:ins w:id="72" w:author="Prashant Kharat" w:date="2025-11-27T12:21:00Z"/>
-        </w:rPr>
-      </w:pPr>
-      <w:ins w:id="73" w:author="Prashant Kharat" w:date="2025-11-27T12:21:00Z">
-        <w:r>
-          <w:t>Do I have to participate?</w:t>
-        </w:r>
-      </w:ins>
+      </w:pPr>
+      <w:r>
+        <w:t>Do I have to participate?</w:t>
+      </w:r>
     </w:p>
     <w:p>
       <w:pPr>
         <w:spacing w:line="276" w:lineRule="auto"/>
         <w:jc w:val="both"/>
-        <w:rPr>
-          <w:ins w:id="74" w:author="Prashant Kharat" w:date="2025-11-27T12:21:00Z"/>
-        </w:rPr>
-      </w:pPr>
-      <w:ins w:id="75" w:author="Prashant Kharat" w:date="2025-11-27T12:21:00Z">
-        <w:r>
-          <w:t>Participation in this study is entirely voluntary. For the follow-up phase of this study (after hospital discharge), we may request you or your relative to sign an Informed Consent Form. However, you are free to change your mind and request us to stop collecting follow-up data at any time without providing a reason. Choosing not to be contacted for follow-up data collection will not affect your future medical treatment or standard care in any way. Any data already collected from your medical records will continue to be used in the analysis, unless you or your relative ask the site research team not to use the previously collected data by signing an 'opt-out' form, which is enclosed with this information sheet. The details of the site research team are provided in this document.</w:t>
-        </w:r>
-      </w:ins>
+      </w:pPr>
+      <w:r>
+        <w:t>Participation in this study is entirely voluntary. For the follow-up phase of this study (after hospital discharge), we may request you or your relative to sign an Informed Consent Form. However, you are free to change your mind and request us to stop collecting follow-up data at any time without providing a reason. Choosing not to be contacted for follow-up data collection will not affect your future medical treatment or standard care in any way. Any data already collected from your medical records will continue to be used in the analysis, unless you or your relative ask the site research team not to use the previously collected data by signing an 'opt-out' form, which is enclosed with this information sheet. The details of the site research team are provided in this document.</w:t>
+      </w:r>
     </w:p>
     <w:p>
       <w:pPr>
@@ -1521,29 +1455,19 @@
         <w:shd w:val="clear" w:color="auto" w:fill="auto"/>
         <w:spacing w:beforeAutospacing="0" w:afterAutospacing="0" w:line="276" w:lineRule="auto"/>
         <w:jc w:val="both"/>
-        <w:rPr>
-          <w:ins w:id="76" w:author="Prashant Kharat" w:date="2025-11-27T12:21:00Z"/>
-        </w:rPr>
-      </w:pPr>
-      <w:ins w:id="77" w:author="Prashant Kharat" w:date="2025-11-27T12:21:00Z">
-        <w:r>
-          <w:t>What will I be required to do?</w:t>
-        </w:r>
-      </w:ins>
+      </w:pPr>
+      <w:r>
+        <w:t>What will I be required to do?</w:t>
+      </w:r>
     </w:p>
     <w:p>
       <w:pPr>
         <w:spacing w:line="276" w:lineRule="auto"/>
         <w:jc w:val="both"/>
-        <w:rPr>
-          <w:ins w:id="78" w:author="Prashant Kharat" w:date="2025-11-27T12:21:00Z"/>
-        </w:rPr>
-      </w:pPr>
-      <w:ins w:id="79" w:author="Prashant Kharat" w:date="2025-11-27T12:21:00Z">
-        <w:r>
-          <w:t>You will be asked to provide responses to questions about your health and recovery during telephonic follow-ups or in-person follow-up visits.</w:t>
-        </w:r>
-      </w:ins>
+      </w:pPr>
+      <w:r>
+        <w:t>You will be asked to provide responses to questions about your health and recovery during telephonic follow-ups or in-person follow-up visits.</w:t>
+      </w:r>
     </w:p>
     <w:p>
       <w:pPr>
@@ -1555,29 +1479,19 @@
         <w:shd w:val="clear" w:color="auto" w:fill="auto"/>
         <w:spacing w:beforeAutospacing="0" w:afterAutospacing="0" w:line="276" w:lineRule="auto"/>
         <w:jc w:val="both"/>
-        <w:rPr>
-          <w:ins w:id="80" w:author="Prashant Kharat" w:date="2025-11-27T12:21:00Z"/>
-        </w:rPr>
-      </w:pPr>
-      <w:ins w:id="81" w:author="Prashant Kharat" w:date="2025-11-27T12:21:00Z">
-        <w:r>
-          <w:t>What are the side effects of the intervention?</w:t>
-        </w:r>
-      </w:ins>
+      </w:pPr>
+      <w:r>
+        <w:t>What are the side effects of the intervention?</w:t>
+      </w:r>
     </w:p>
     <w:p>
       <w:pPr>
         <w:spacing w:line="276" w:lineRule="auto"/>
         <w:jc w:val="both"/>
-        <w:rPr>
-          <w:ins w:id="82" w:author="Prashant Kharat" w:date="2025-11-27T12:21:00Z"/>
-        </w:rPr>
-      </w:pPr>
-      <w:ins w:id="83" w:author="Prashant Kharat" w:date="2025-11-27T12:21:00Z">
-        <w:r>
-          <w:t>There are no foreseeable side effects of this intervention, as no direct intervention will be administered to you.</w:t>
-        </w:r>
-      </w:ins>
+      </w:pPr>
+      <w:r>
+        <w:t>There are no foreseeable side effects of this intervention, as no direct intervention will be administered to you.</w:t>
+      </w:r>
     </w:p>
     <w:p>
       <w:pPr>
@@ -1589,29 +1503,19 @@
         <w:shd w:val="clear" w:color="auto" w:fill="auto"/>
         <w:spacing w:beforeAutospacing="0" w:afterAutospacing="0" w:line="276" w:lineRule="auto"/>
         <w:jc w:val="both"/>
-        <w:rPr>
-          <w:ins w:id="84" w:author="Prashant Kharat" w:date="2025-11-27T12:21:00Z"/>
-        </w:rPr>
-      </w:pPr>
-      <w:ins w:id="85" w:author="Prashant Kharat" w:date="2025-11-27T12:21:00Z">
-        <w:r>
-          <w:t>What are the potential disadvantages and risks of participating?</w:t>
-        </w:r>
-      </w:ins>
+      </w:pPr>
+      <w:r>
+        <w:t>What are the potential disadvantages and risks of participating?</w:t>
+      </w:r>
     </w:p>
     <w:p>
       <w:pPr>
         <w:spacing w:line="276" w:lineRule="auto"/>
         <w:jc w:val="both"/>
-        <w:rPr>
-          <w:ins w:id="86" w:author="Prashant Kharat" w:date="2025-11-27T12:21:00Z"/>
-        </w:rPr>
-      </w:pPr>
-      <w:ins w:id="87" w:author="Prashant Kharat" w:date="2025-11-27T12:21:00Z">
-        <w:r>
-          <w:t>We have not identified any risks associated with participating in this study.</w:t>
-        </w:r>
-      </w:ins>
+      </w:pPr>
+      <w:r>
+        <w:t>We have not identified any risks associated with participating in this study.</w:t>
+      </w:r>
     </w:p>
     <w:p>
       <w:pPr>
@@ -1623,29 +1527,20 @@
         <w:shd w:val="clear" w:color="auto" w:fill="auto"/>
         <w:spacing w:beforeAutospacing="0" w:afterAutospacing="0" w:line="276" w:lineRule="auto"/>
         <w:jc w:val="both"/>
-        <w:rPr>
-          <w:ins w:id="88" w:author="Prashant Kharat" w:date="2025-11-27T12:21:00Z"/>
-        </w:rPr>
-      </w:pPr>
-      <w:ins w:id="89" w:author="Prashant Kharat" w:date="2025-11-27T12:21:00Z">
-        <w:r>
-          <w:t>What are the possible benefits of participating?</w:t>
-        </w:r>
-      </w:ins>
+      </w:pPr>
+      <w:r>
+        <w:t>What are the possible benefits of participating?</w:t>
+      </w:r>
     </w:p>
     <w:p>
       <w:pPr>
         <w:spacing w:line="276" w:lineRule="auto"/>
         <w:jc w:val="both"/>
-        <w:rPr>
-          <w:ins w:id="90" w:author="Prashant Kharat" w:date="2025-11-27T12:21:00Z"/>
-        </w:rPr>
-      </w:pPr>
-      <w:ins w:id="91" w:author="Prashant Kharat" w:date="2025-11-27T12:21:00Z">
-        <w:r>
-          <w:t>Our research may help to discover tools that better identify injured patients in need of immediate care. While this research will not affect the care you receive in this hospital, its results may benefit others who are injured in the future. There is no guarantee that you will benefit directly from this study. However, your participation will contribute to medical knowledge about the use of this intervention.</w:t>
-        </w:r>
-      </w:ins>
+      </w:pPr>
+      <w:r>
+        <w:lastRenderedPageBreak/>
+        <w:t>Our research may help to discover tools that better identify injured patients in need of immediate care. While this research will not affect the care you receive in this hospital, its results may benefit others who are injured in the future. There is no guarantee that you will benefit directly from this study. However, your participation will contribute to medical knowledge about the use of this intervention.</w:t>
+      </w:r>
     </w:p>
     <w:p>
       <w:pPr>
@@ -1657,29 +1552,19 @@
         <w:shd w:val="clear" w:color="auto" w:fill="auto"/>
         <w:spacing w:beforeAutospacing="0" w:afterAutospacing="0" w:line="276" w:lineRule="auto"/>
         <w:jc w:val="both"/>
-        <w:rPr>
-          <w:ins w:id="92" w:author="Prashant Kharat" w:date="2025-11-27T12:21:00Z"/>
-        </w:rPr>
-      </w:pPr>
-      <w:ins w:id="93" w:author="Prashant Kharat" w:date="2025-11-27T12:21:00Z">
-        <w:r>
-          <w:t>Can I be compensated for participating?</w:t>
-        </w:r>
-      </w:ins>
+      </w:pPr>
+      <w:r>
+        <w:t>Can I be compensated for participating?</w:t>
+      </w:r>
     </w:p>
     <w:p>
       <w:pPr>
         <w:spacing w:line="276" w:lineRule="auto"/>
         <w:jc w:val="both"/>
-        <w:rPr>
-          <w:ins w:id="94" w:author="Prashant Kharat" w:date="2025-11-27T12:21:00Z"/>
-        </w:rPr>
-      </w:pPr>
-      <w:ins w:id="95" w:author="Prashant Kharat" w:date="2025-11-27T12:21:00Z">
-        <w:r>
-          <w:t>You will not receive any payment for participating in this study.</w:t>
-        </w:r>
-      </w:ins>
+      </w:pPr>
+      <w:r>
+        <w:t>You will not receive any payment for participating in this study.</w:t>
+      </w:r>
     </w:p>
     <w:p>
       <w:pPr>
@@ -1691,30 +1576,19 @@
         <w:shd w:val="clear" w:color="auto" w:fill="auto"/>
         <w:spacing w:beforeAutospacing="0" w:afterAutospacing="0" w:line="276" w:lineRule="auto"/>
         <w:jc w:val="both"/>
-        <w:rPr>
-          <w:ins w:id="96" w:author="Prashant Kharat" w:date="2025-11-27T12:21:00Z"/>
-        </w:rPr>
-      </w:pPr>
-      <w:ins w:id="97" w:author="Prashant Kharat" w:date="2025-11-27T12:21:00Z">
-        <w:r>
-          <w:t>What if I decide I no longer wish to participate?</w:t>
-        </w:r>
-      </w:ins>
+      </w:pPr>
+      <w:r>
+        <w:t>What if I decide I no longer wish to participate?</w:t>
+      </w:r>
     </w:p>
     <w:p>
       <w:pPr>
         <w:spacing w:line="276" w:lineRule="auto"/>
         <w:jc w:val="both"/>
-        <w:rPr>
-          <w:ins w:id="98" w:author="Prashant Kharat" w:date="2025-11-27T12:21:00Z"/>
-        </w:rPr>
-      </w:pPr>
-      <w:ins w:id="99" w:author="Prashant Kharat" w:date="2025-11-27T12:21:00Z">
-        <w:r>
-          <w:lastRenderedPageBreak/>
-          <w:t>You are free to withdraw from this study at any time without needing to provide a reason. Your decision will not affect your future care or medical treatment.</w:t>
-        </w:r>
-      </w:ins>
+      </w:pPr>
+      <w:r>
+        <w:t>You are free to withdraw from this study at any time without needing to provide a reason. Your decision will not affect your future care or medical treatment.</w:t>
+      </w:r>
     </w:p>
     <w:p>
       <w:pPr>
@@ -1726,29 +1600,19 @@
         <w:shd w:val="clear" w:color="auto" w:fill="auto"/>
         <w:spacing w:beforeAutospacing="0" w:afterAutospacing="0" w:line="276" w:lineRule="auto"/>
         <w:jc w:val="both"/>
-        <w:rPr>
-          <w:ins w:id="100" w:author="Prashant Kharat" w:date="2025-11-27T12:21:00Z"/>
-        </w:rPr>
-      </w:pPr>
-      <w:ins w:id="101" w:author="Prashant Kharat" w:date="2025-11-27T12:21:00Z">
-        <w:r>
-          <w:t>Will my participation in this study be kept confidential?</w:t>
-        </w:r>
-      </w:ins>
+      </w:pPr>
+      <w:r>
+        <w:t>Will my participation in this study be kept confidential?</w:t>
+      </w:r>
     </w:p>
     <w:p>
       <w:pPr>
         <w:spacing w:line="276" w:lineRule="auto"/>
         <w:jc w:val="both"/>
-        <w:rPr>
-          <w:ins w:id="102" w:author="Prashant Kharat" w:date="2025-11-27T12:21:00Z"/>
-        </w:rPr>
-      </w:pPr>
-      <w:ins w:id="103" w:author="Prashant Kharat" w:date="2025-11-27T12:21:00Z">
-        <w:r>
-          <w:t>All information collected about you as part of your participation in this study will be kept strictly confidential and used solely for research purposes. Your information will be anonymized and stored on a highly secured server. All de-identified information about you will be managed in accordance with Indian data protection laws to ensure the utmost confidentiality. At the end of the study, your anonymized and grouped data may be shared with researchers outside the George Institute for Global Health, both in India and internationally, to further advance knowledge on injury care.</w:t>
-        </w:r>
-      </w:ins>
+      </w:pPr>
+      <w:r>
+        <w:t>All information collected about you as part of your participation in this study will be kept strictly confidential and used solely for research purposes. Your information will be anonymized and stored on a highly secured server. All de-identified information about you will be managed in accordance with Indian data protection laws to ensure the utmost confidentiality. At the end of the study, your anonymized and grouped data may be shared with researchers outside the George Institute for Global Health, both in India and internationally, to further advance knowledge on injury care.</w:t>
+      </w:r>
     </w:p>
     <w:p>
       <w:pPr>
@@ -1760,29 +1624,19 @@
         <w:shd w:val="clear" w:color="auto" w:fill="auto"/>
         <w:spacing w:beforeAutospacing="0" w:afterAutospacing="0" w:line="276" w:lineRule="auto"/>
         <w:jc w:val="both"/>
-        <w:rPr>
-          <w:ins w:id="104" w:author="Prashant Kharat" w:date="2025-11-27T12:21:00Z"/>
-        </w:rPr>
-      </w:pPr>
-      <w:ins w:id="105" w:author="Prashant Kharat" w:date="2025-11-27T12:21:00Z">
-        <w:r>
-          <w:t>What will happen to the results of this study?</w:t>
-        </w:r>
-      </w:ins>
+      </w:pPr>
+      <w:r>
+        <w:t>What will happen to the results of this study?</w:t>
+      </w:r>
     </w:p>
     <w:p>
       <w:pPr>
         <w:spacing w:line="276" w:lineRule="auto"/>
         <w:jc w:val="both"/>
-        <w:rPr>
-          <w:ins w:id="106" w:author="Prashant Kharat" w:date="2025-11-27T12:21:00Z"/>
-        </w:rPr>
-      </w:pPr>
-      <w:ins w:id="107" w:author="Prashant Kharat" w:date="2025-11-27T12:21:00Z">
-        <w:r>
-          <w:t>The findings of this research may be published in scientific journals; however, it will not be possible to identify you from any published article. Additionally, data from this project may be shared with other researchers in India and abroad without revealing your identity.</w:t>
-        </w:r>
-      </w:ins>
+      </w:pPr>
+      <w:r>
+        <w:t>The findings of this research may be published in scientific journals; however, it will not be possible to identify you from any published article. Additionally, data from this project may be shared with other researchers in India and abroad without revealing your identity.</w:t>
+      </w:r>
     </w:p>
     <w:p>
       <w:pPr>
@@ -1794,399 +1648,66 @@
         <w:shd w:val="clear" w:color="auto" w:fill="auto"/>
         <w:spacing w:beforeAutospacing="0" w:afterAutospacing="0" w:line="276" w:lineRule="auto"/>
         <w:jc w:val="both"/>
-        <w:rPr>
-          <w:ins w:id="108" w:author="Prashant Kharat" w:date="2025-11-27T12:21:00Z"/>
-        </w:rPr>
-      </w:pPr>
-      <w:ins w:id="109" w:author="Prashant Kharat" w:date="2025-11-27T12:21:00Z">
-        <w:r>
-          <w:t>Who is funding this study?</w:t>
-        </w:r>
-      </w:ins>
+      </w:pPr>
+      <w:r>
+        <w:t>Who is funding this study?</w:t>
+      </w:r>
     </w:p>
     <w:p>
       <w:pPr>
         <w:spacing w:line="276" w:lineRule="auto"/>
         <w:jc w:val="both"/>
-        <w:rPr>
-          <w:ins w:id="110" w:author="Prashant Kharat" w:date="2025-11-27T12:21:00Z"/>
-        </w:rPr>
-      </w:pPr>
-      <w:ins w:id="111" w:author="Prashant Kharat" w:date="2025-11-27T12:21:00Z">
-        <w:r>
-          <w:t xml:space="preserve">This study is supported by the Karolinska </w:t>
-        </w:r>
-        <w:proofErr w:type="spellStart"/>
-        <w:r>
-          <w:t>Institutet</w:t>
-        </w:r>
-        <w:proofErr w:type="spellEnd"/>
-        <w:r>
-          <w:t>, Sweden, through a grant from the Swedish Research Council.</w:t>
-        </w:r>
-      </w:ins>
+      </w:pPr>
+      <w:r>
+        <w:t xml:space="preserve">This study is supported by the Karolinska </w:t>
+      </w:r>
+      <w:proofErr w:type="spellStart"/>
+      <w:r>
+        <w:t>Institutet</w:t>
+      </w:r>
+      <w:proofErr w:type="spellEnd"/>
+      <w:r>
+        <w:t>, Sweden, through a grant from the Swedish Research Council.</w:t>
+      </w:r>
     </w:p>
     <w:p>
       <w:pPr>
         <w:spacing w:line="276" w:lineRule="auto"/>
         <w:jc w:val="both"/>
-        <w:rPr>
-          <w:ins w:id="112" w:author="Prashant Kharat" w:date="2025-11-27T12:21:00Z"/>
-        </w:rPr>
-      </w:pPr>
-      <w:ins w:id="113" w:author="Prashant Kharat" w:date="2025-11-27T12:21:00Z">
-        <w:r>
-          <w:t>If you have questions about this research study, you may contact the Principal Investigator.</w:t>
-        </w:r>
-      </w:ins>
-    </w:p>
-    <w:p>
-      <w:pPr>
-        <w:pStyle w:val="NormalWeb"/>
-        <w:rPr>
-          <w:ins w:id="114" w:author="sranjan@masonlive.gmu.edu" w:date="2025-11-11T11:36:00Z"/>
-        </w:rPr>
-      </w:pPr>
-      <w:ins w:id="115" w:author="Prashant Kharat" w:date="2025-11-27T12:21:00Z">
-        <w:r>
-          <w:rPr>
-            <w:b/>
-            <w:bCs/>
-          </w:rPr>
-          <w:t>Opt out summary:</w:t>
-        </w:r>
-        <w:r>
-          <w:t xml:space="preserve"> 1. I hereby request deletion of any routine medical information previously collected about me (or my relative) and ask that no further data be collected for this study.</w:t>
-        </w:r>
-        <w:r>
-          <w:br/>
-          <w:t>2. I also request that we not be contacted — by phone or in person — for any follow-up data collection.</w:t>
-        </w:r>
-        <w:r>
-          <w:br/>
-        </w:r>
-      </w:ins>
-    </w:p>
-    <w:p>
-      <w:pPr>
-        <w:pStyle w:val="NormalWeb"/>
-        <w:rPr>
-          <w:del w:id="116" w:author="sranjan@masonlive.gmu.edu" w:date="2025-12-05T16:45:00Z" w16du:dateUtc="2025-12-05T21:45:00Z"/>
-        </w:rPr>
-      </w:pPr>
-      <w:ins w:id="117" w:author="sranjan@masonlive.gmu.edu" w:date="2025-11-11T11:36:00Z">
-        <w:r>
-          <w:t>Since the trial is pan India, consent form has been translated into the regional languages. CRC takes the consent in the local languages, which the participants or its relatives are in comfortable with.</w:t>
-        </w:r>
-      </w:ins>
-    </w:p>
-    <w:p>
-      <w:pPr>
-        <w:pStyle w:val="NormalWeb"/>
-        <w:rPr>
-          <w:ins w:id="118" w:author="Prashant Kharat" w:date="2025-11-27T12:21:00Z"/>
-        </w:rPr>
-      </w:pPr>
-    </w:p>
-    <w:tbl>
-      <w:tblPr>
-        <w:tblStyle w:val="TableGrid"/>
-        <w:tblW w:w="0" w:type="auto"/>
-        <w:tblLayout w:type="fixed"/>
-        <w:tblLook w:val="04A0" w:firstRow="1" w:lastRow="0" w:firstColumn="1" w:lastColumn="0" w:noHBand="0" w:noVBand="1"/>
-      </w:tblPr>
-      <w:tblGrid>
-        <w:gridCol w:w="733"/>
-        <w:gridCol w:w="3007"/>
-        <w:gridCol w:w="1925"/>
-        <w:gridCol w:w="3351"/>
-      </w:tblGrid>
-      <w:tr>
-        <w:trPr>
-          <w:ins w:id="119" w:author="Prashant Kharat" w:date="2025-11-27T12:21:00Z"/>
-        </w:trPr>
-        <w:tc>
-          <w:tcPr>
-            <w:tcW w:w="733" w:type="dxa"/>
-          </w:tcPr>
-          <w:p>
-            <w:pPr>
-              <w:rPr>
-                <w:ins w:id="120" w:author="Prashant Kharat" w:date="2025-11-27T12:21:00Z"/>
-              </w:rPr>
-            </w:pPr>
-            <w:ins w:id="121" w:author="Prashant Kharat" w:date="2025-11-27T12:21:00Z">
-              <w:r>
-                <w:t>Sr. No.</w:t>
-              </w:r>
-            </w:ins>
-          </w:p>
-        </w:tc>
-        <w:tc>
-          <w:tcPr>
-            <w:tcW w:w="3007" w:type="dxa"/>
-          </w:tcPr>
-          <w:p>
-            <w:pPr>
-              <w:rPr>
-                <w:ins w:id="122" w:author="Prashant Kharat" w:date="2025-11-27T12:21:00Z"/>
-              </w:rPr>
-            </w:pPr>
-            <w:ins w:id="123" w:author="Prashant Kharat" w:date="2025-11-27T12:21:00Z">
-              <w:r>
-                <w:t>EC</w:t>
-              </w:r>
-              <w:r>
-                <w:t xml:space="preserve"> </w:t>
-              </w:r>
-              <w:r>
-                <w:t>and</w:t>
-              </w:r>
-              <w:r>
-                <w:t xml:space="preserve"> </w:t>
-              </w:r>
-              <w:r>
-                <w:t>Site Name</w:t>
-              </w:r>
-            </w:ins>
-          </w:p>
-        </w:tc>
-        <w:tc>
-          <w:tcPr>
-            <w:tcW w:w="1925" w:type="dxa"/>
-          </w:tcPr>
-          <w:p>
-            <w:pPr>
-              <w:rPr>
-                <w:ins w:id="124" w:author="Prashant Kharat" w:date="2025-11-27T12:21:00Z"/>
-              </w:rPr>
-            </w:pPr>
-            <w:ins w:id="125" w:author="Prashant Kharat" w:date="2025-11-27T12:21:00Z">
-              <w:r>
-                <w:t>EC Approval Reference Number</w:t>
-              </w:r>
-            </w:ins>
-          </w:p>
-        </w:tc>
-        <w:tc>
-          <w:tcPr>
-            <w:tcW w:w="3351" w:type="dxa"/>
-          </w:tcPr>
-          <w:p>
-            <w:pPr>
-              <w:rPr>
-                <w:ins w:id="126" w:author="Prashant Kharat" w:date="2025-11-27T12:21:00Z"/>
-              </w:rPr>
-            </w:pPr>
-            <w:ins w:id="127" w:author="Prashant Kharat" w:date="2025-11-27T12:21:00Z">
-              <w:r>
-                <w:t>Text from EC Approval Letter</w:t>
-              </w:r>
-            </w:ins>
-          </w:p>
-        </w:tc>
-      </w:tr>
-      <w:tr>
-        <w:trPr>
-          <w:trHeight w:val="2328"/>
-          <w:ins w:id="128" w:author="Prashant Kharat" w:date="2025-11-27T12:21:00Z"/>
-        </w:trPr>
-        <w:tc>
-          <w:tcPr>
-            <w:tcW w:w="733" w:type="dxa"/>
-          </w:tcPr>
-          <w:p>
-            <w:pPr>
-              <w:rPr>
-                <w:ins w:id="129" w:author="Prashant Kharat" w:date="2025-11-27T12:21:00Z"/>
-              </w:rPr>
-            </w:pPr>
-            <w:ins w:id="130" w:author="Prashant Kharat" w:date="2025-11-27T12:21:00Z">
-              <w:r>
-                <w:lastRenderedPageBreak/>
-                <w:t>1</w:t>
-              </w:r>
-            </w:ins>
-          </w:p>
-        </w:tc>
-        <w:tc>
-          <w:tcPr>
-            <w:tcW w:w="3007" w:type="dxa"/>
-          </w:tcPr>
-          <w:p>
-            <w:pPr>
-              <w:shd w:val="clear" w:color="auto" w:fill="auto"/>
-              <w:rPr>
-                <w:ins w:id="131" w:author="Prashant Kharat" w:date="2025-11-27T12:21:00Z"/>
-                <w:rFonts w:eastAsiaTheme="minorEastAsia"/>
-                <w:color w:val="auto"/>
-              </w:rPr>
-            </w:pPr>
-            <w:ins w:id="132" w:author="Prashant Kharat" w:date="2025-11-27T12:21:00Z">
-              <w:r>
-                <w:t xml:space="preserve">Institutional Ethics Committee, </w:t>
-              </w:r>
-              <w:proofErr w:type="spellStart"/>
-              <w:r>
-                <w:rPr>
-                  <w:rFonts w:eastAsiaTheme="minorEastAsia"/>
-                  <w:color w:val="auto"/>
-                </w:rPr>
-                <w:t>Hinduhridaysamrat</w:t>
-              </w:r>
-              <w:proofErr w:type="spellEnd"/>
-              <w:r>
-                <w:rPr>
-                  <w:rFonts w:eastAsiaTheme="minorEastAsia"/>
-                  <w:color w:val="auto"/>
-                </w:rPr>
-                <w:t xml:space="preserve"> </w:t>
-              </w:r>
-              <w:proofErr w:type="spellStart"/>
-              <w:r>
-                <w:rPr>
-                  <w:rFonts w:eastAsiaTheme="minorEastAsia"/>
-                  <w:color w:val="auto"/>
-                </w:rPr>
-                <w:t>Balasaheb</w:t>
-              </w:r>
-              <w:proofErr w:type="spellEnd"/>
-              <w:r>
-                <w:rPr>
-                  <w:rFonts w:eastAsiaTheme="minorEastAsia"/>
-                  <w:color w:val="auto"/>
-                </w:rPr>
-                <w:t xml:space="preserve"> Thackeray Medical College and Dr. R. N. Cooper Municipal General Hospital</w:t>
-              </w:r>
-              <w:r>
-                <w:t>, Mumbai-400056.</w:t>
-              </w:r>
-            </w:ins>
-          </w:p>
-        </w:tc>
-        <w:tc>
-          <w:tcPr>
-            <w:tcW w:w="1925" w:type="dxa"/>
-          </w:tcPr>
-          <w:p>
-            <w:pPr>
-              <w:rPr>
-                <w:ins w:id="133" w:author="Prashant Kharat" w:date="2025-11-27T12:21:00Z"/>
-              </w:rPr>
-            </w:pPr>
-            <w:ins w:id="134" w:author="Prashant Kharat" w:date="2025-11-27T12:21:00Z">
-              <w:r>
-                <w:t>HBTMC/IEC/72-2024/0/RP/249/13082024/2025</w:t>
-              </w:r>
-            </w:ins>
-          </w:p>
-        </w:tc>
-        <w:tc>
-          <w:tcPr>
-            <w:tcW w:w="3351" w:type="dxa"/>
-          </w:tcPr>
-          <w:p>
-            <w:pPr>
-              <w:rPr>
-                <w:ins w:id="135" w:author="Prashant Kharat" w:date="2025-11-27T12:21:00Z"/>
-              </w:rPr>
-            </w:pPr>
-            <w:ins w:id="136" w:author="Prashant Kharat" w:date="2025-11-27T12:21:00Z">
-              <w:r>
-                <w:t>We approve the study to be conducted in its presented form based upon reviewing study documents which included: Clinical Trial Protocol, CRF and Health Questionnaires, PIS-ICD, Assent Form – English, Hindi and Marathi.</w:t>
-              </w:r>
-            </w:ins>
-          </w:p>
-        </w:tc>
-      </w:tr>
-      <w:tr>
-        <w:trPr>
-          <w:ins w:id="137" w:author="Prashant Kharat" w:date="2025-11-27T12:21:00Z"/>
-        </w:trPr>
-        <w:tc>
-          <w:tcPr>
-            <w:tcW w:w="733" w:type="dxa"/>
-          </w:tcPr>
-          <w:p>
-            <w:pPr>
-              <w:rPr>
-                <w:ins w:id="138" w:author="Prashant Kharat" w:date="2025-11-27T12:21:00Z"/>
-              </w:rPr>
-            </w:pPr>
-            <w:ins w:id="139" w:author="Prashant Kharat" w:date="2025-11-27T12:21:00Z">
-              <w:r>
-                <w:t>2</w:t>
-              </w:r>
-            </w:ins>
-          </w:p>
-        </w:tc>
-        <w:tc>
-          <w:tcPr>
-            <w:tcW w:w="3007" w:type="dxa"/>
-          </w:tcPr>
-          <w:p>
-            <w:pPr>
-              <w:rPr>
-                <w:ins w:id="140" w:author="Prashant Kharat" w:date="2025-11-27T12:21:00Z"/>
-              </w:rPr>
-            </w:pPr>
-            <w:ins w:id="141" w:author="Prashant Kharat" w:date="2025-11-27T12:21:00Z">
-              <w:r>
-                <w:t>Institute Ethics Committee, Holy Family Hospital, Delhi-110025.</w:t>
-              </w:r>
-            </w:ins>
-          </w:p>
-        </w:tc>
-        <w:tc>
-          <w:tcPr>
-            <w:tcW w:w="1925" w:type="dxa"/>
-          </w:tcPr>
-          <w:p>
-            <w:pPr>
-              <w:rPr>
-                <w:ins w:id="142" w:author="Prashant Kharat" w:date="2025-11-27T12:21:00Z"/>
-              </w:rPr>
-            </w:pPr>
-            <w:ins w:id="143" w:author="Prashant Kharat" w:date="2025-11-27T12:21:00Z">
-              <w:r>
-                <w:t>HFH/Admin/2025/132</w:t>
-              </w:r>
-            </w:ins>
-          </w:p>
-        </w:tc>
-        <w:tc>
-          <w:tcPr>
-            <w:tcW w:w="3351" w:type="dxa"/>
-          </w:tcPr>
-          <w:p>
-            <w:pPr>
-              <w:rPr>
-                <w:ins w:id="144" w:author="Prashant Kharat" w:date="2025-11-27T12:21:00Z"/>
-              </w:rPr>
-            </w:pPr>
-            <w:ins w:id="145" w:author="Prashant Kharat" w:date="2025-11-27T12:21:00Z">
-              <w:r>
-                <w:t>Following Documents were reviewed: Study Protocol, CRF and Health Questionnaires, PIS-ICD, Assent Form – English and Hindi. After Careful consideration, the IEC grants ethical approval for the conduct of this study.</w:t>
-              </w:r>
-            </w:ins>
-          </w:p>
-        </w:tc>
-      </w:tr>
-    </w:tbl>
-    <w:p>
-      <w:pPr>
-        <w:pStyle w:val="NormalWeb"/>
-      </w:pPr>
-    </w:p>
-    <w:p>
-      <w:pPr>
-        <w:pStyle w:val="NormalWeb"/>
-      </w:pPr>
-      <w:r>
-        <w:rPr>
-          <w:b/>
-          <w:bCs/>
-        </w:rPr>
+      </w:pPr>
+      <w:r>
+        <w:t>If you have questions about this research study, you may contact the Principal Investigator.</w:t>
+      </w:r>
+    </w:p>
+    <w:p>
+      <w:pPr>
+        <w:pStyle w:val="NormalWeb"/>
+      </w:pPr>
+      <w:r>
+        <w:rPr>
+          <w:b/>
+          <w:bCs/>
+        </w:rPr>
+        <w:t>Opt out summary:</w:t>
+      </w:r>
+      <w:r>
+        <w:t xml:space="preserve"> 1. I hereby request deletion of any routine medical information previously collected about me (or my relative) and ask that no further data be collected for this study.</w:t>
+      </w:r>
+      <w:r>
+        <w:br/>
+        <w:t>2. I also request that we not be contacted — by phone or in person — for any follow-up data collection.</w:t>
+      </w:r>
+    </w:p>
+    <w:p>
+      <w:pPr>
+        <w:pStyle w:val="NormalWeb"/>
+      </w:pPr>
+      <w:r>
+        <w:rPr>
+          <w:b/>
+          <w:bCs/>
+        </w:rPr>
+        <w:lastRenderedPageBreak/>
         <w:t>Q2.13</w:t>
       </w:r>
       <w:r>
@@ -2213,16 +1734,16 @@
       <w:r>
         <w:t xml:space="preserve">Participant consent is obtained by the designated CRC at each site, either from the participant or from the nearest kin, </w:t>
       </w:r>
-      <w:commentRangeStart w:id="146"/>
+      <w:commentRangeStart w:id="21"/>
       <w:r>
         <w:t>depending on the participant’s level of consciousness</w:t>
       </w:r>
-      <w:commentRangeEnd w:id="146"/>
+      <w:commentRangeEnd w:id="21"/>
       <w:r>
         <w:rPr>
           <w:rStyle w:val="CommentReference"/>
         </w:rPr>
-        <w:commentReference w:id="146"/>
+        <w:commentReference w:id="21"/>
       </w:r>
       <w:r>
         <w:t>. If consent is obtained from the nearest kin, re-consent will be sought from the participant once they are in a condition to provide consent.</w:t>
@@ -2240,7 +1761,7 @@
       <w:pPr>
         <w:pStyle w:val="NormalWeb"/>
         <w:rPr>
-          <w:ins w:id="147" w:author="sranjan@masonlive.gmu.edu" w:date="2025-11-11T11:42:00Z"/>
+          <w:ins w:id="22" w:author="sranjan@masonlive.gmu.edu" w:date="2025-11-11T11:42:00Z"/>
         </w:rPr>
       </w:pPr>
       <w:r>
@@ -2257,11 +1778,11 @@
       <w:r>
         <w:t xml:space="preserve">7) </w:t>
       </w:r>
-      <w:commentRangeStart w:id="148"/>
+      <w:commentRangeStart w:id="23"/>
       <w:r>
         <w:t>Adherence (fidelity) measurement</w:t>
       </w:r>
-      <w:commentRangeEnd w:id="148"/>
+      <w:commentRangeEnd w:id="23"/>
       <w:r>
         <w:rPr>
           <w:rStyle w:val="CommentReference"/>
@@ -2272,7 +1793,7 @@
           <w:lang w:val="en-US" w:eastAsia="en-US"/>
           <w14:ligatures w14:val="standardContextual"/>
         </w:rPr>
-        <w:commentReference w:id="148"/>
+        <w:commentReference w:id="23"/>
       </w:r>
     </w:p>
     <w:p>
@@ -2314,114 +1835,114 @@
           <w:b/>
           <w:bCs/>
         </w:rPr>
+        <w:t>R2.14</w:t>
+      </w:r>
+      <w:r>
+        <w:rPr>
+          <w:b/>
+          <w:bCs/>
+        </w:rPr>
+        <w:t xml:space="preserve"> </w:t>
+      </w:r>
+      <w:r>
+        <w:t xml:space="preserve">Adherence is assessed by trained CRCs. The training </w:t>
+      </w:r>
+      <w:proofErr w:type="gramStart"/>
+      <w:r>
+        <w:t>involve</w:t>
+      </w:r>
+      <w:proofErr w:type="gramEnd"/>
+      <w:r>
+        <w:t xml:space="preserve"> online sessions on ATLS procedures using the designated checklist. Before collecting this data for the trial, CRCs collect pilot data from ten patients under the supervision of a local investigator or senior clinician. This pilot data is then discussed with the trial team. We do not formally assess inter-rater reliability for this secondary outcome. The CRCs are not blinded to period.</w:t>
+      </w:r>
+    </w:p>
+    <w:p>
+      <w:pPr>
+        <w:pStyle w:val="NormalWeb"/>
+      </w:pPr>
+      <w:r>
+        <w:rPr>
+          <w:b/>
+          <w:bCs/>
+        </w:rPr>
+        <w:t>Q2.15</w:t>
+      </w:r>
+      <w:r>
+        <w:t xml:space="preserve"> </w:t>
+      </w:r>
+      <w:r>
+        <w:t>State plans to minimise Hawthorne bias (e.g., discreet observation, sampling across shifts) and how missing adherence observations will be handled.</w:t>
+      </w:r>
+    </w:p>
+    <w:p>
+      <w:pPr>
+        <w:pStyle w:val="NormalWeb"/>
+      </w:pPr>
+      <w:r>
+        <w:rPr>
+          <w:b/>
+          <w:bCs/>
+        </w:rPr>
+        <w:t>R2.15</w:t>
+      </w:r>
+      <w:r>
+        <w:t xml:space="preserve"> The busy, crowded and noisy environment where the observations are taking place help limit </w:t>
+      </w:r>
+      <w:r>
+        <w:t>Hawthorne bias</w:t>
+      </w:r>
+      <w:r>
+        <w:t>. The nested staircase design and sampled shifts also helps in limiting this bias. Missing adherence observations will be handled as missing, and managed using the methods described under item 20c.</w:t>
+      </w:r>
+    </w:p>
+    <w:p>
+      <w:pPr>
+        <w:pStyle w:val="NormalWeb"/>
+      </w:pPr>
+      <w:r>
+        <w:t>8) Harms definition and reporting</w:t>
+      </w:r>
+    </w:p>
+    <w:p>
+      <w:pPr>
+        <w:pStyle w:val="NormalWeb"/>
+      </w:pPr>
+      <w:r>
+        <w:t>Issue: Protocol excludes routine AE/SAE reporting because events are common in critically ill patients but identifies a small set of "safety events". The approach risks underreporting intervention-related harms or unintended consequences (e.g., delays in care due to added tasks).</w:t>
+      </w:r>
+    </w:p>
+    <w:p>
+      <w:pPr>
+        <w:pStyle w:val="NormalWeb"/>
+      </w:pPr>
+      <w:r>
         <w:lastRenderedPageBreak/>
-        <w:t>R2.14</w:t>
-      </w:r>
-      <w:r>
-        <w:rPr>
-          <w:b/>
-          <w:bCs/>
-        </w:rPr>
+        <w:t>Suggested actions:</w:t>
+      </w:r>
+    </w:p>
+    <w:p>
+      <w:pPr>
+        <w:pStyle w:val="NormalWeb"/>
+        <w:rPr>
+          <w:ins w:id="24" w:author="sranjan@masonlive.gmu.edu" w:date="2025-12-05T16:52:00Z" w16du:dateUtc="2025-12-05T21:52:00Z"/>
+        </w:rPr>
+      </w:pPr>
+      <w:r>
+        <w:rPr>
+          <w:b/>
+          <w:bCs/>
+        </w:rPr>
+        <w:t>Q2.16</w:t>
+      </w:r>
+      <w:r>
         <w:t xml:space="preserve"> </w:t>
       </w:r>
-      <w:r>
-        <w:t xml:space="preserve">Adherence is assessed by trained CRCs. The training </w:t>
-      </w:r>
-      <w:proofErr w:type="gramStart"/>
-      <w:r>
-        <w:t>involve</w:t>
-      </w:r>
-      <w:proofErr w:type="gramEnd"/>
-      <w:r>
-        <w:t xml:space="preserve"> online sessions on ATLS procedures using the designated checklist. Before collecting this data for the trial, CRCs collect pilot data from ten patients under the supervision of a local investigator or senior clinician. This pilot data is then discussed with the trial team. We do not formally assess inter-rater reliability for this secondary outcome. The CRCs are not blinded to period.</w:t>
-      </w:r>
-    </w:p>
-    <w:p>
-      <w:pPr>
-        <w:pStyle w:val="NormalWeb"/>
-      </w:pPr>
-      <w:r>
-        <w:rPr>
-          <w:b/>
-          <w:bCs/>
-        </w:rPr>
-        <w:t>Q2.15</w:t>
-      </w:r>
-      <w:r>
-        <w:t xml:space="preserve"> </w:t>
-      </w:r>
-      <w:r>
-        <w:t>State plans to minimise Hawthorne bias (e.g., discreet observation, sampling across shifts) and how missing adherence observations will be handled.</w:t>
-      </w:r>
-    </w:p>
-    <w:p>
-      <w:pPr>
-        <w:pStyle w:val="NormalWeb"/>
-      </w:pPr>
-      <w:r>
-        <w:rPr>
-          <w:b/>
-          <w:bCs/>
-        </w:rPr>
-        <w:t>R2.15</w:t>
-      </w:r>
-      <w:r>
-        <w:t xml:space="preserve"> The busy, crowded and noisy environment where the observations are taking place help limit </w:t>
-      </w:r>
-      <w:r>
-        <w:t>Hawthorne bias</w:t>
-      </w:r>
-      <w:r>
-        <w:t>. The nested staircase design and sampled shifts also helps in limiting this bias. Missing adherence observations will be handled as missing, and managed using the methods described under item 20c.</w:t>
-      </w:r>
-    </w:p>
-    <w:p>
-      <w:pPr>
-        <w:pStyle w:val="NormalWeb"/>
-      </w:pPr>
-      <w:r>
-        <w:t>8) Harms definition and reporting</w:t>
-      </w:r>
-    </w:p>
-    <w:p>
-      <w:pPr>
-        <w:pStyle w:val="NormalWeb"/>
-      </w:pPr>
-      <w:r>
-        <w:t>Issue: Protocol excludes routine AE/SAE reporting because events are common in critically ill patients but identifies a small set of "safety events". The approach risks underreporting intervention-related harms or unintended consequences (e.g., delays in care due to added tasks).</w:t>
-      </w:r>
-    </w:p>
-    <w:p>
-      <w:pPr>
-        <w:pStyle w:val="NormalWeb"/>
-      </w:pPr>
-      <w:r>
-        <w:t>Suggested actions:</w:t>
-      </w:r>
-    </w:p>
-    <w:p>
-      <w:pPr>
-        <w:pStyle w:val="NormalWeb"/>
-        <w:rPr>
-          <w:ins w:id="149" w:author="sranjan@masonlive.gmu.edu" w:date="2025-12-05T16:52:00Z" w16du:dateUtc="2025-12-05T21:52:00Z"/>
-        </w:rPr>
-      </w:pPr>
-      <w:r>
-        <w:rPr>
-          <w:b/>
-          <w:bCs/>
-        </w:rPr>
-        <w:t>Q2.16</w:t>
-      </w:r>
-      <w:r>
-        <w:t xml:space="preserve"> </w:t>
-      </w:r>
-      <w:commentRangeStart w:id="150"/>
-      <w:commentRangeStart w:id="151"/>
+      <w:commentRangeStart w:id="25"/>
+      <w:commentRangeStart w:id="26"/>
       <w:r>
         <w:t xml:space="preserve">Define a more comprehensive, preplanned list or criteria for safety signal detection beyond the three items listed, and specify how increases will be assessed (statistically vs. clinically). Clarify </w:t>
       </w:r>
-      <w:commentRangeEnd w:id="150"/>
+      <w:commentRangeEnd w:id="25"/>
       <w:r>
         <w:rPr>
           <w:rStyle w:val="CommentReference"/>
@@ -2432,9 +1953,9 @@
           <w:lang w:val="en-US" w:eastAsia="en-US"/>
           <w14:ligatures w14:val="standardContextual"/>
         </w:rPr>
-        <w:commentReference w:id="150"/>
-      </w:r>
-      <w:commentRangeEnd w:id="151"/>
+        <w:commentReference w:id="25"/>
+      </w:r>
+      <w:commentRangeEnd w:id="26"/>
       <w:r>
         <w:rPr>
           <w:rStyle w:val="CommentReference"/>
@@ -2445,14 +1966,14 @@
           <w:lang w:val="en-US" w:eastAsia="en-US"/>
           <w14:ligatures w14:val="standardContextual"/>
         </w:rPr>
-        <w:commentReference w:id="151"/>
-      </w:r>
-      <w:commentRangeStart w:id="152"/>
-      <w:commentRangeStart w:id="153"/>
+        <w:commentReference w:id="26"/>
+      </w:r>
+      <w:commentRangeStart w:id="27"/>
+      <w:commentRangeStart w:id="28"/>
       <w:r>
         <w:t>reporting timelines and responsibilities.</w:t>
       </w:r>
-      <w:commentRangeEnd w:id="152"/>
+      <w:commentRangeEnd w:id="27"/>
       <w:r>
         <w:rPr>
           <w:rStyle w:val="CommentReference"/>
@@ -2463,294 +1984,25 @@
           <w:lang w:val="en-US" w:eastAsia="en-US"/>
           <w14:ligatures w14:val="standardContextual"/>
         </w:rPr>
-        <w:commentReference w:id="152"/>
-      </w:r>
-      <w:commentRangeEnd w:id="153"/>
+        <w:commentReference w:id="27"/>
+      </w:r>
+      <w:commentRangeEnd w:id="28"/>
       <w:r>
         <w:rPr>
           <w:rStyle w:val="CommentReference"/>
         </w:rPr>
-        <w:commentReference w:id="153"/>
-      </w:r>
-    </w:p>
-    <w:p>
-      <w:pPr>
-        <w:pStyle w:val="NormalWeb"/>
-        <w:rPr>
-          <w:ins w:id="154" w:author="sranjan@masonlive.gmu.edu" w:date="2025-12-05T16:52:00Z"/>
-        </w:rPr>
-      </w:pPr>
-      <w:ins w:id="155" w:author="sranjan@masonlive.gmu.edu" w:date="2025-12-05T16:52:00Z">
-        <w:r>
-          <w:rPr>
-            <w:lang w:val="en-IN"/>
-          </w:rPr>
-          <w:t>This trial will not collect adverse events or serious adverse events. Only the enlisted events will be documented as safety events. Safety events to be tracked both in standard care and in intervention phase. Any other safety events that are identified by the clinical research coordinators or local investigators during the trial will also be reported. This may include missed injuries or missed investigations, which could be suspected if certain injuries or investigations are identified during the intervention phase.  </w:t>
-        </w:r>
-      </w:ins>
-    </w:p>
-    <w:p>
-      <w:pPr>
-        <w:pStyle w:val="NormalWeb"/>
-        <w:rPr>
-          <w:ins w:id="156" w:author="sranjan@masonlive.gmu.edu" w:date="2025-12-05T16:52:00Z"/>
-        </w:rPr>
-      </w:pPr>
-      <w:ins w:id="157" w:author="sranjan@masonlive.gmu.edu" w:date="2025-12-05T16:52:00Z">
-        <w:r>
-          <w:rPr>
-            <w:lang w:val="en-IN"/>
-          </w:rPr>
-          <w:t>The safety events will include following: </w:t>
-        </w:r>
-      </w:ins>
-    </w:p>
-    <w:p>
-      <w:pPr>
-        <w:pStyle w:val="NormalWeb"/>
-        <w:numPr>
-          <w:ilvl w:val="0"/>
-          <w:numId w:val="3"/>
-        </w:numPr>
-        <w:rPr>
-          <w:ins w:id="158" w:author="sranjan@masonlive.gmu.edu" w:date="2025-12-05T16:52:00Z"/>
-        </w:rPr>
-      </w:pPr>
-      <w:ins w:id="159" w:author="sranjan@masonlive.gmu.edu" w:date="2025-12-05T16:52:00Z">
-        <w:r>
-          <w:rPr>
-            <w:lang w:val="en-IN"/>
-          </w:rPr>
-          <w:t>There is a life-threatening condition  </w:t>
-        </w:r>
-      </w:ins>
-    </w:p>
-    <w:p>
-      <w:pPr>
-        <w:pStyle w:val="NormalWeb"/>
-        <w:numPr>
-          <w:ilvl w:val="0"/>
-          <w:numId w:val="3"/>
-        </w:numPr>
-        <w:rPr>
-          <w:ins w:id="160" w:author="sranjan@masonlive.gmu.edu" w:date="2025-12-05T16:52:00Z"/>
-        </w:rPr>
-      </w:pPr>
-      <w:ins w:id="161" w:author="sranjan@masonlive.gmu.edu" w:date="2025-12-05T16:52:00Z">
-        <w:r>
-          <w:rPr>
-            <w:lang w:val="en-IN"/>
-          </w:rPr>
-          <w:t>Prolong hospitalization </w:t>
-        </w:r>
-      </w:ins>
-    </w:p>
-    <w:p>
-      <w:pPr>
-        <w:pStyle w:val="NormalWeb"/>
-        <w:numPr>
-          <w:ilvl w:val="0"/>
-          <w:numId w:val="3"/>
-        </w:numPr>
-        <w:rPr>
-          <w:ins w:id="162" w:author="sranjan@masonlive.gmu.edu" w:date="2025-12-05T16:52:00Z"/>
-        </w:rPr>
-      </w:pPr>
-      <w:ins w:id="163" w:author="sranjan@masonlive.gmu.edu" w:date="2025-12-05T16:52:00Z">
-        <w:r>
-          <w:rPr>
-            <w:lang w:val="en-IN"/>
-          </w:rPr>
-          <w:t>Result in meaningful harm to the participant </w:t>
-        </w:r>
-      </w:ins>
-    </w:p>
-    <w:p>
-      <w:pPr>
-        <w:pStyle w:val="NormalWeb"/>
-        <w:numPr>
-          <w:ilvl w:val="0"/>
-          <w:numId w:val="3"/>
-        </w:numPr>
-        <w:rPr>
-          <w:ins w:id="164" w:author="sranjan@masonlive.gmu.edu" w:date="2025-12-05T16:52:00Z"/>
-        </w:rPr>
-      </w:pPr>
-      <w:ins w:id="165" w:author="sranjan@masonlive.gmu.edu" w:date="2025-12-05T16:52:00Z">
-        <w:r>
-          <w:rPr>
-            <w:lang w:val="en-IN"/>
-          </w:rPr>
-          <w:t>Prolonged mechanical ventilation (&gt; 7 days) </w:t>
-        </w:r>
-      </w:ins>
-    </w:p>
-    <w:p>
-      <w:pPr>
-        <w:pStyle w:val="NormalWeb"/>
-        <w:numPr>
-          <w:ilvl w:val="0"/>
-          <w:numId w:val="3"/>
-        </w:numPr>
-        <w:rPr>
-          <w:ins w:id="166" w:author="sranjan@masonlive.gmu.edu" w:date="2025-12-05T16:52:00Z"/>
-        </w:rPr>
-      </w:pPr>
-      <w:ins w:id="167" w:author="sranjan@masonlive.gmu.edu" w:date="2025-12-05T16:52:00Z">
-        <w:r>
-          <w:rPr>
-            <w:lang w:val="en-IN"/>
-          </w:rPr>
-          <w:t>Initiation of renal replacement therapy </w:t>
-        </w:r>
-      </w:ins>
-    </w:p>
-    <w:p>
-      <w:pPr>
-        <w:pStyle w:val="NormalWeb"/>
-        <w:numPr>
-          <w:ilvl w:val="0"/>
-          <w:numId w:val="3"/>
-        </w:numPr>
-        <w:rPr>
-          <w:ins w:id="168" w:author="sranjan@masonlive.gmu.edu" w:date="2025-12-05T16:52:00Z"/>
-        </w:rPr>
-      </w:pPr>
-      <w:ins w:id="169" w:author="sranjan@masonlive.gmu.edu" w:date="2025-12-05T16:52:00Z">
-        <w:r>
-          <w:rPr>
-            <w:lang w:val="en-IN"/>
-          </w:rPr>
-          <w:t>Prolonged (&gt; 2 days) or renewed (restart after at least 2 days without) use of </w:t>
-        </w:r>
-      </w:ins>
-    </w:p>
-    <w:p>
-      <w:pPr>
-        <w:pStyle w:val="NormalWeb"/>
-      </w:pPr>
-      <w:ins w:id="170" w:author="sranjan@masonlive.gmu.edu" w:date="2025-12-05T16:52:00Z">
-        <w:r>
-          <w:rPr>
-            <w:lang w:val="en-IN"/>
-          </w:rPr>
-          <w:t>All safety events will be recorded in the Case Record Form (CRF). It will be the responsibility of the PI assess the safety event and</w:t>
-        </w:r>
-        <w:r>
-          <w:rPr>
-            <w:b/>
-            <w:bCs/>
-            <w:lang w:val="en-IN"/>
-          </w:rPr>
-          <w:t xml:space="preserve"> </w:t>
-        </w:r>
-        <w:r>
-          <w:rPr>
-            <w:lang w:val="en-IN"/>
-          </w:rPr>
-          <w:t xml:space="preserve">to report the event to </w:t>
-        </w:r>
-        <w:r>
-          <w:rPr>
-            <w:b/>
-            <w:bCs/>
-            <w:lang w:val="en-IN"/>
-          </w:rPr>
-          <w:t>TMG within 24 hours</w:t>
-        </w:r>
-        <w:r>
-          <w:rPr>
-            <w:lang w:val="en-IN"/>
-          </w:rPr>
-          <w:t xml:space="preserve"> of its occurrence by the site via email. Events that are considered probably related will be reported immediately to the Trial Steering and Data Monitoring Committee (SDMC) via email </w:t>
-        </w:r>
-        <w:r>
-          <w:rPr>
-            <w:b/>
-            <w:bCs/>
-            <w:lang w:val="en-IN"/>
-          </w:rPr>
-          <w:t>within 5 working days</w:t>
-        </w:r>
-        <w:r>
-          <w:rPr>
-            <w:lang w:val="en-IN"/>
-          </w:rPr>
-          <w:t xml:space="preserve"> via an email. </w:t>
-        </w:r>
-      </w:ins>
-      <w:ins w:id="171" w:author="sranjan@masonlive.gmu.edu" w:date="2025-12-05T16:54:00Z" w16du:dateUtc="2025-12-05T21:54:00Z">
-        <w:r>
-          <w:rPr>
-            <w:lang w:val="en-IN"/>
-            <w:rPrChange w:id="172" w:author="sranjan@masonlive.gmu.edu" w:date="2025-12-05T16:54:00Z" w16du:dateUtc="2025-12-05T21:54:00Z">
-              <w:rPr>
-                <w:b/>
-                <w:bCs/>
-                <w:lang w:val="en-IN"/>
-              </w:rPr>
-            </w:rPrChange>
-          </w:rPr>
-          <w:t>In addition to this</w:t>
-        </w:r>
-        <w:r>
-          <w:rPr>
-            <w:lang w:val="en-IN"/>
-          </w:rPr>
-          <w:t xml:space="preserve">, </w:t>
-        </w:r>
-        <w:r>
-          <w:rPr>
-            <w:b/>
-            <w:bCs/>
-            <w:lang w:val="en-IN"/>
-          </w:rPr>
-          <w:t xml:space="preserve"> </w:t>
-        </w:r>
-      </w:ins>
-      <w:ins w:id="173" w:author="sranjan@masonlive.gmu.edu" w:date="2025-12-05T16:57:00Z" w16du:dateUtc="2025-12-05T21:57:00Z">
-        <w:r>
-          <w:rPr>
-            <w:lang w:val="en-IN"/>
-          </w:rPr>
-          <w:t xml:space="preserve">each </w:t>
-        </w:r>
-      </w:ins>
-      <w:ins w:id="174" w:author="sranjan@masonlive.gmu.edu" w:date="2025-12-05T16:58:00Z" w16du:dateUtc="2025-12-05T21:58:00Z">
-        <w:r>
-          <w:rPr>
-            <w:lang w:val="en-IN"/>
-          </w:rPr>
-          <w:t xml:space="preserve">of the respective </w:t>
-        </w:r>
-      </w:ins>
-      <w:ins w:id="175" w:author="sranjan@masonlive.gmu.edu" w:date="2025-12-05T16:57:00Z" w16du:dateUtc="2025-12-05T21:57:00Z">
-        <w:r>
-          <w:rPr>
-            <w:lang w:val="en-IN"/>
-          </w:rPr>
-          <w:t>site has the</w:t>
-        </w:r>
-      </w:ins>
-      <w:ins w:id="176" w:author="sranjan@masonlive.gmu.edu" w:date="2025-12-05T16:52:00Z">
-        <w:r>
-          <w:rPr>
-            <w:lang w:val="en-IN"/>
-          </w:rPr>
-          <w:t xml:space="preserve"> responsibility to inform their IEC as per the requirements by the ethics.  </w:t>
-        </w:r>
-      </w:ins>
-    </w:p>
-    <w:p>
-      <w:pPr>
-        <w:pStyle w:val="NormalWeb"/>
-      </w:pPr>
-      <w:r>
-        <w:rPr>
-          <w:b/>
-          <w:bCs/>
-        </w:rPr>
-        <w:lastRenderedPageBreak/>
+        <w:commentReference w:id="28"/>
+      </w:r>
+    </w:p>
+    <w:p>
+      <w:pPr>
+        <w:pStyle w:val="NormalWeb"/>
+      </w:pPr>
+      <w:r>
+        <w:rPr>
+          <w:b/>
+          <w:bCs/>
+        </w:rPr>
         <w:t>R2.16</w:t>
       </w:r>
       <w:r>
@@ -2948,11 +2200,11 @@
       <w:r>
         <w:t xml:space="preserve"> </w:t>
       </w:r>
-      <w:commentRangeStart w:id="177"/>
+      <w:commentRangeStart w:id="29"/>
       <w:r>
         <w:t>Competing</w:t>
       </w:r>
-      <w:commentRangeEnd w:id="177"/>
+      <w:commentRangeEnd w:id="29"/>
       <w:r>
         <w:rPr>
           <w:rStyle w:val="CommentReference"/>
@@ -2963,7 +2215,7 @@
           <w:lang w:val="en-US" w:eastAsia="en-US"/>
           <w14:ligatures w14:val="standardContextual"/>
         </w:rPr>
-        <w:commentReference w:id="177"/>
+        <w:commentReference w:id="29"/>
       </w:r>
       <w:r>
         <w:t xml:space="preserve"> interests: Several contributors are ATLS® instructors — consider describing mitigation (e.g., independent data analysis, sponsor non-involvement).</w:t>
@@ -2978,6 +2230,7 @@
           <w:b/>
           <w:bCs/>
         </w:rPr>
+        <w:lastRenderedPageBreak/>
         <w:t>R2.21</w:t>
       </w:r>
       <w:r>
@@ -3026,7 +2279,6 @@
           <w:b/>
           <w:bCs/>
         </w:rPr>
-        <w:lastRenderedPageBreak/>
         <w:t>R2.22</w:t>
       </w:r>
       <w:r>
@@ -3126,7 +2378,7 @@
       </w:r>
     </w:p>
   </w:comment>
-  <w:comment w:id="9" w:author="sranjan@masonlive.gmu.edu" w:date="2025-11-11T10:47:00Z" w:initials="SR">
+  <w:comment w:id="5" w:author="sranjan@masonlive.gmu.edu" w:date="2025-11-11T10:47:00Z" w:initials="SR">
     <w:p>
       <w:r>
         <w:rPr>
@@ -3139,7 +2391,7 @@
       </w:r>
     </w:p>
   </w:comment>
-  <w:comment w:id="10" w:author="Martin Gerdin Wärnberg" w:date="2025-11-22T05:26:00Z" w:initials="MG">
+  <w:comment w:id="6" w:author="Martin Gerdin Wärnberg" w:date="2025-11-22T05:26:00Z" w:initials="MG">
     <w:p>
       <w:r>
         <w:rPr>
@@ -3156,7 +2408,7 @@
       </w:r>
     </w:p>
   </w:comment>
-  <w:comment w:id="11" w:author="sranjan@masonlive.gmu.edu" w:date="2025-11-11T12:45:00Z" w:initials="SR">
+  <w:comment w:id="7" w:author="sranjan@masonlive.gmu.edu" w:date="2025-11-11T12:45:00Z" w:initials="SR">
     <w:p>
       <w:r>
         <w:rPr>
@@ -3169,7 +2421,7 @@
       </w:r>
     </w:p>
   </w:comment>
-  <w:comment w:id="12" w:author="Martin Gerdin Wärnberg" w:date="2025-11-22T05:43:00Z" w:initials="MG">
+  <w:comment w:id="8" w:author="Martin Gerdin Wärnberg" w:date="2025-11-22T05:43:00Z" w:initials="MG">
     <w:p>
       <w:r>
         <w:rPr>
@@ -3186,7 +2438,7 @@
       </w:r>
     </w:p>
   </w:comment>
-  <w:comment w:id="13" w:author="Prashant Kharat" w:date="2025-11-27T12:20:00Z" w:initials="PK">
+  <w:comment w:id="9" w:author="Prashant Kharat" w:date="2025-11-27T12:20:00Z" w:initials="PK">
     <w:p>
       <w:pPr>
         <w:pStyle w:val="CommentText"/>
@@ -3202,7 +2454,7 @@
       </w:r>
     </w:p>
   </w:comment>
-  <w:comment w:id="14" w:author="sranjan@masonlive.gmu.edu" w:date="2025-12-05T16:43:00Z" w:initials="SR">
+  <w:comment w:id="10" w:author="sranjan@masonlive.gmu.edu" w:date="2025-12-05T16:43:00Z" w:initials="SR">
     <w:p>
       <w:r>
         <w:rPr>
@@ -3228,7 +2480,7 @@
       </w:r>
     </w:p>
   </w:comment>
-  <w:comment w:id="32" w:author="Monty Khajanchi" w:date="2025-11-27T05:22:00Z" w:initials="MK">
+  <w:comment w:id="13" w:author="Monty Khajanchi" w:date="2025-11-27T05:22:00Z" w:initials="MK">
     <w:p>
       <w:pPr>
         <w:pStyle w:val="CommentText"/>
@@ -3247,7 +2499,33 @@
       </w:r>
     </w:p>
   </w:comment>
-  <w:comment w:id="33" w:author="Jessica Kasza" w:date="2025-12-01T13:21:00Z" w:initials="JK">
+  <w:comment w:id="14" w:author="sranjan@masonlive.gmu.edu" w:date="2025-11-11T12:46:00Z" w:initials="SR">
+    <w:p>
+      <w:r>
+        <w:rPr>
+          <w:rStyle w:val="CommentReference"/>
+        </w:rPr>
+        <w:annotationRef/>
+      </w:r>
+      <w:r>
+        <w:t>stats team to answer</w:t>
+      </w:r>
+    </w:p>
+  </w:comment>
+  <w:comment w:id="16" w:author="sranjan@masonlive.gmu.edu" w:date="2025-11-11T10:51:00Z" w:initials="SR">
+    <w:p>
+      <w:r>
+        <w:rPr>
+          <w:rStyle w:val="CommentReference"/>
+        </w:rPr>
+        <w:annotationRef/>
+      </w:r>
+      <w:r>
+        <w:t>Probably stats team can provide answer on these.</w:t>
+      </w:r>
+    </w:p>
+  </w:comment>
+  <w:comment w:id="17" w:author="Jessica Kasza" w:date="2025-12-01T13:28:00Z" w:initials="JK">
     <w:p>
       <w:pPr>
         <w:pStyle w:val="CommentText"/>
@@ -3259,31 +2537,69 @@
         <w:annotationRef/>
       </w:r>
       <w:r>
-        <w:t>For stepped wedge trials it is difficult to blind the analysing statistician since treatment and time are related to each other: at the start of each batch, all clusters will implement the control, and at the end of each batch, all clusters implement the intervention. So blinding is not straightforward for stepped wedge designs (and variants of stepped wedge designs like staircase designs and batched variants).</w:t>
-      </w:r>
-      <w:r>
-        <w:br/>
-      </w:r>
-      <w:r>
-        <w:br/>
-        <w:t xml:space="preserve">Anonymised period labels would only be useful if the within-cluster correlation structure does not depend on the order of the periods. </w:t>
-      </w:r>
-    </w:p>
+        <w:t>Here I recommend re-stating that period effects will be adjusted for in all models and this will account for secular trends. It will be assumed that there is no informative cluster size.</w:t>
+      </w:r>
+    </w:p>
+  </w:comment>
+  <w:comment w:id="18" w:author="sranjan@masonlive.gmu.edu" w:date="2025-11-11T10:56:00Z" w:initials="SR">
+    <w:p>
+      <w:r>
+        <w:rPr>
+          <w:rStyle w:val="CommentReference"/>
+        </w:rPr>
+        <w:annotationRef/>
+      </w:r>
+      <w:r>
+        <w:t>I remember in the last steering committee meeting there were certain discussion on the interim analysis. Not sure, if it covers all the details mentioned here. @Martin, could you please address this.</w:t>
+      </w:r>
+    </w:p>
+  </w:comment>
+  <w:comment w:id="19" w:author="sranjan@masonlive.gmu.edu" w:date="2025-11-11T10:58:00Z" w:initials="SR">
+    <w:p>
+      <w:r>
+        <w:rPr>
+          <w:rStyle w:val="CommentReference"/>
+        </w:rPr>
+        <w:annotationRef/>
+      </w:r>
+      <w:r>
+        <w:t>@Prashant to add, the content from Informed consent document for opt-out consent. Also, the ethics approval number.</w:t>
+      </w:r>
+    </w:p>
+  </w:comment>
+  <w:comment w:id="20" w:author="sranjan@masonlive.gmu.edu" w:date="2025-11-11T11:33:00Z" w:initials="SR">
+    <w:p>
+      <w:r>
+        <w:rPr>
+          <w:rStyle w:val="CommentReference"/>
+        </w:rPr>
+        <w:annotationRef/>
+      </w:r>
+      <w:r>
+        <w:t>Will paraphrase, once the text is added.</w:t>
+      </w:r>
+    </w:p>
+  </w:comment>
+  <w:comment w:id="21" w:author="Monty Khajanchi" w:date="2025-11-27T05:43:00Z" w:initials="MK">
     <w:p>
       <w:pPr>
         <w:pStyle w:val="CommentText"/>
       </w:pPr>
-    </w:p>
-    <w:p>
-      <w:pPr>
-        <w:pStyle w:val="CommentText"/>
-      </w:pPr>
-      <w:r>
-        <w:t xml:space="preserve">Instead I would recommend to protect against issues to do with an unblinded analysis of the data that a full statistical analysis plan – including example code and descriptions of all sensitivity analyses – be developed and published online prior to the statistician receiving any data. </w:t>
+      <w:r>
+        <w:rPr>
+          <w:rStyle w:val="CommentReference"/>
+        </w:rPr>
+        <w:annotationRef/>
+      </w:r>
+      <w:r>
+        <w:rPr>
+          <w:lang w:val="en-IN"/>
+        </w:rPr>
+        <w:t xml:space="preserve">We mention the time of the first consent- After we screen and find patient eligible in the ER for inclusion in the study we take consent from the participant or the nearest kin, before recording any variable. </w:t>
       </w:r>
     </w:p>
   </w:comment>
-  <w:comment w:id="34" w:author="Martin Gerdin Wärnberg" w:date="2025-11-22T05:44:00Z" w:initials="MG">
+  <w:comment w:id="23" w:author="sranjan@masonlive.gmu.edu" w:date="2025-11-11T11:43:00Z" w:initials="SR">
     <w:p>
       <w:r>
         <w:rPr>
@@ -3292,19 +2608,12 @@
         <w:annotationRef/>
       </w:r>
       <w:r>
-        <w:rPr>
-          <w:sz w:val="20"/>
-          <w:szCs w:val="18"/>
-        </w:rPr>
-        <w:t>Needs to be discussed further.</w:t>
+        <w:t>@Martin, stats team can probably answer this better</w:t>
       </w:r>
     </w:p>
   </w:comment>
-  <w:comment w:id="35" w:author="Monty Khajanchi" w:date="2025-11-27T05:31:00Z" w:initials="MK">
-    <w:p>
-      <w:pPr>
-        <w:pStyle w:val="CommentText"/>
-      </w:pPr>
+  <w:comment w:id="25" w:author="sranjan@masonlive.gmu.edu" w:date="2025-11-11T11:50:00Z" w:initials="SR">
+    <w:p>
       <w:r>
         <w:rPr>
           <w:rStyle w:val="CommentReference"/>
@@ -3312,14 +2621,11 @@
         <w:annotationRef/>
       </w:r>
       <w:r>
-        <w:rPr>
-          <w:lang w:val="en-IN"/>
-        </w:rPr>
-        <w:t xml:space="preserve">Why should allocation be obvious. Statistician will have raw data without how many and which centre has collected it. </w:t>
+        <w:t>@Prashant and Martin, to add if we have added any additional points in the safety reporting.</w:t>
       </w:r>
     </w:p>
   </w:comment>
-  <w:comment w:id="36" w:author="sranjan@masonlive.gmu.edu" w:date="2025-11-11T12:46:00Z" w:initials="SR">
+  <w:comment w:id="26" w:author="sranjan@masonlive.gmu.edu" w:date="2025-11-11T11:50:00Z" w:initials="SR">
     <w:p>
       <w:r>
         <w:rPr>
@@ -3328,15 +2634,12 @@
         <w:annotationRef/>
       </w:r>
       <w:r>
-        <w:t>stats team to answer</w:t>
+        <w:t>Regarding the comment on assessment clinically versus and statistically, not sure about this.</w:t>
       </w:r>
     </w:p>
   </w:comment>
-  <w:comment w:id="37" w:author="Jessica Kasza" w:date="2025-12-01T13:27:00Z" w:initials="JK">
-    <w:p>
-      <w:pPr>
-        <w:pStyle w:val="CommentText"/>
-      </w:pPr>
+  <w:comment w:id="27" w:author="sranjan@masonlive.gmu.edu" w:date="2025-11-11T11:53:00Z" w:initials="SR">
+    <w:p>
       <w:r>
         <w:rPr>
           <w:rStyle w:val="CommentReference"/>
@@ -3344,167 +2647,11 @@
         <w:annotationRef/>
       </w:r>
       <w:r>
-        <w:t>Could state that this will be fully described in the statistical analysis plan, to be published online prior to data analysis.</w:t>
+        <w:t>@Prashant, could you refer the monitoring plan and manual of operation for reporting timeline. Just copy and paste the narrative, I can make the edits.</w:t>
       </w:r>
     </w:p>
   </w:comment>
-  <w:comment w:id="38" w:author="sranjan@masonlive.gmu.edu" w:date="2025-11-11T10:51:00Z" w:initials="SR">
-    <w:p>
-      <w:r>
-        <w:rPr>
-          <w:rStyle w:val="CommentReference"/>
-        </w:rPr>
-        <w:annotationRef/>
-      </w:r>
-      <w:r>
-        <w:t>Probably stats team can provide answer on these.</w:t>
-      </w:r>
-    </w:p>
-  </w:comment>
-  <w:comment w:id="39" w:author="Jessica Kasza" w:date="2025-12-01T13:28:00Z" w:initials="JK">
-    <w:p>
-      <w:pPr>
-        <w:pStyle w:val="CommentText"/>
-      </w:pPr>
-      <w:r>
-        <w:rPr>
-          <w:rStyle w:val="CommentReference"/>
-        </w:rPr>
-        <w:annotationRef/>
-      </w:r>
-      <w:r>
-        <w:t>Here I recommend re-stating that period effects will be adjusted for in all models and this will account for secular trends. It will be assumed that there is no informative cluster size.</w:t>
-      </w:r>
-    </w:p>
-  </w:comment>
-  <w:comment w:id="40" w:author="sranjan@masonlive.gmu.edu" w:date="2025-11-11T10:56:00Z" w:initials="SR">
-    <w:p>
-      <w:r>
-        <w:rPr>
-          <w:rStyle w:val="CommentReference"/>
-        </w:rPr>
-        <w:annotationRef/>
-      </w:r>
-      <w:r>
-        <w:t>I remember in the last steering committee meeting there were certain discussion on the interim analysis. Not sure, if it covers all the details mentioned here. @Martin, could you please address this.</w:t>
-      </w:r>
-    </w:p>
-  </w:comment>
-  <w:comment w:id="41" w:author="sranjan@masonlive.gmu.edu" w:date="2025-11-11T10:58:00Z" w:initials="SR">
-    <w:p>
-      <w:r>
-        <w:rPr>
-          <w:rStyle w:val="CommentReference"/>
-        </w:rPr>
-        <w:annotationRef/>
-      </w:r>
-      <w:r>
-        <w:t>@Prashant to add, the content from Informed consent document for opt-out consent. Also, the ethics approval number.</w:t>
-      </w:r>
-    </w:p>
-  </w:comment>
-  <w:comment w:id="42" w:author="sranjan@masonlive.gmu.edu" w:date="2025-11-11T11:33:00Z" w:initials="SR">
-    <w:p>
-      <w:r>
-        <w:rPr>
-          <w:rStyle w:val="CommentReference"/>
-        </w:rPr>
-        <w:annotationRef/>
-      </w:r>
-      <w:r>
-        <w:t>Will paraphrase, once the text is added.</w:t>
-      </w:r>
-    </w:p>
-  </w:comment>
-  <w:comment w:id="44" w:author="Martin Gerdin Wärnberg" w:date="2025-11-22T05:59:00Z" w:initials="MG">
-    <w:p>
-      <w:r>
-        <w:rPr>
-          <w:rStyle w:val="CommentReference"/>
-        </w:rPr>
-        <w:annotationRef/>
-      </w:r>
-      <w:r>
-        <w:rPr>
-          <w:sz w:val="20"/>
-          <w:szCs w:val="18"/>
-        </w:rPr>
-        <w:t>@prashant, please summarise the information provided to the participants regarding the opt-out consent.</w:t>
-      </w:r>
-    </w:p>
-  </w:comment>
-  <w:comment w:id="146" w:author="Monty Khajanchi" w:date="2025-11-27T05:43:00Z" w:initials="MK">
-    <w:p>
-      <w:pPr>
-        <w:pStyle w:val="CommentText"/>
-      </w:pPr>
-      <w:r>
-        <w:rPr>
-          <w:rStyle w:val="CommentReference"/>
-        </w:rPr>
-        <w:annotationRef/>
-      </w:r>
-      <w:r>
-        <w:rPr>
-          <w:lang w:val="en-IN"/>
-        </w:rPr>
-        <w:t xml:space="preserve">We mention the time of the first consent- After we screen and find patient eligible in the ER for inclusion in the study we take consent from the participant or the nearest kin, before recording any variable. </w:t>
-      </w:r>
-    </w:p>
-  </w:comment>
-  <w:comment w:id="148" w:author="sranjan@masonlive.gmu.edu" w:date="2025-11-11T11:43:00Z" w:initials="SR">
-    <w:p>
-      <w:r>
-        <w:rPr>
-          <w:rStyle w:val="CommentReference"/>
-        </w:rPr>
-        <w:annotationRef/>
-      </w:r>
-      <w:r>
-        <w:t>@Martin, stats team can probably answer this better</w:t>
-      </w:r>
-    </w:p>
-  </w:comment>
-  <w:comment w:id="150" w:author="sranjan@masonlive.gmu.edu" w:date="2025-11-11T11:50:00Z" w:initials="SR">
-    <w:p>
-      <w:r>
-        <w:rPr>
-          <w:rStyle w:val="CommentReference"/>
-        </w:rPr>
-        <w:annotationRef/>
-      </w:r>
-      <w:r>
-        <w:t>@Prashant and Martin, to add if we have added any additional points in the safety reporting.</w:t>
-      </w:r>
-    </w:p>
-  </w:comment>
-  <w:comment w:id="151" w:author="sranjan@masonlive.gmu.edu" w:date="2025-11-11T11:50:00Z" w:initials="SR">
-    <w:p>
-      <w:r>
-        <w:rPr>
-          <w:rStyle w:val="CommentReference"/>
-        </w:rPr>
-        <w:annotationRef/>
-      </w:r>
-      <w:r>
-        <w:t>Regarding the comment on assessment clinically versus and statistically, not sure about this.</w:t>
-      </w:r>
-    </w:p>
-  </w:comment>
-  <w:comment w:id="152" w:author="sranjan@masonlive.gmu.edu" w:date="2025-11-11T11:53:00Z" w:initials="SR">
-    <w:p>
-      <w:r>
-        <w:rPr>
-          <w:rStyle w:val="CommentReference"/>
-        </w:rPr>
-        <w:annotationRef/>
-      </w:r>
-      <w:r>
-        <w:t>@Prashant, could you refer the monitoring plan and manual of operation for reporting timeline. Just copy and paste the narrative, I can make the edits.</w:t>
-      </w:r>
-    </w:p>
-  </w:comment>
-  <w:comment w:id="153" w:author="Prashant Kharat" w:date="2025-11-27T12:23:00Z" w:initials="PK">
+  <w:comment w:id="28" w:author="Prashant Kharat" w:date="2025-11-27T12:23:00Z" w:initials="PK">
     <w:p>
       <w:pPr>
         <w:pStyle w:val="CommentText"/>
@@ -4261,7 +3408,7 @@
       </w:r>
     </w:p>
   </w:comment>
-  <w:comment w:id="177" w:author="sranjan@masonlive.gmu.edu" w:date="2025-11-11T12:40:00Z" w:initials="SR">
+  <w:comment w:id="29" w:author="sranjan@masonlive.gmu.edu" w:date="2025-11-11T12:40:00Z" w:initials="SR">
     <w:p>
       <w:r>
         <w:rPr>
@@ -4279,36 +3426,31 @@
 
 <file path=word/commentsExtended.xml><?xml version="1.0" encoding="utf-8"?>
 <w15:commentsEx xmlns:wpc="http://schemas.microsoft.com/office/word/2010/wordprocessingCanvas" xmlns:cx="http://schemas.microsoft.com/office/drawing/2014/chartex" xmlns:cx1="http://schemas.microsoft.com/office/drawing/2015/9/8/chartex" xmlns:cx2="http://schemas.microsoft.com/office/drawing/2015/10/21/chartex" xmlns:cx3="http://schemas.microsoft.com/office/drawing/2016/5/9/chartex" xmlns:cx4="http://schemas.microsoft.com/office/drawing/2016/5/10/chartex" xmlns:cx5="http://schemas.microsoft.com/office/drawing/2016/5/11/chartex" xmlns:cx6="http://schemas.microsoft.com/office/drawing/2016/5/12/chartex" xmlns:cx7="http://schemas.microsoft.com/office/drawing/2016/5/13/chartex" xmlns:cx8="http://schemas.microsoft.com/office/drawing/2016/5/14/chartex" xmlns:mc="http://schemas.openxmlformats.org/markup-compatibility/2006" xmlns:aink="http://schemas.microsoft.com/office/drawing/2016/ink" xmlns:am3d="http://schemas.microsoft.com/office/drawing/2017/model3d" xmlns:o="urn:schemas-microsoft-com:office:office" xmlns:oel="http://schemas.microsoft.com/office/2019/extlst" xmlns:r="http://schemas.openxmlformats.org/officeDocument/2006/relationships" xmlns:m="http://schemas.openxmlformats.org/officeDocument/2006/math" xmlns:v="urn:schemas-microsoft-com:vml" xmlns:wp14="http://schemas.microsoft.com/office/word/2010/wordprocessingDrawing" xmlns:wp="http://schemas.openxmlformats.org/drawingml/2006/wordprocessingDrawing" xmlns:w10="urn:schemas-microsoft-com:office:word" xmlns:w="http://schemas.openxmlformats.org/wordprocessingml/2006/main" xmlns:w14="http://schemas.microsoft.com/office/word/2010/wordml" xmlns:w15="http://schemas.microsoft.com/office/word/2012/wordml" xmlns:w16cex="http://schemas.microsoft.com/office/word/2018/wordml/cex" xmlns:w16cid="http://schemas.microsoft.com/office/word/2016/wordml/cid" xmlns:w16="http://schemas.microsoft.com/office/word/2018/wordml" xmlns:w16du="http://schemas.microsoft.com/office/word/2023/wordml/word16du" xmlns:w16sdtdh="http://schemas.microsoft.com/office/word/2020/wordml/sdtdatahash" xmlns:w16sdtfl="http://schemas.microsoft.com/office/word/2024/wordml/sdtformatlock" xmlns:w16se="http://schemas.microsoft.com/office/word/2015/wordml/symex" xmlns:wpg="http://schemas.microsoft.com/office/word/2010/wordprocessingGroup" xmlns:wpi="http://schemas.microsoft.com/office/word/2010/wordprocessingInk" xmlns:wne="http://schemas.microsoft.com/office/word/2006/wordml" xmlns:wps="http://schemas.microsoft.com/office/word/2010/wordprocessingShape" mc:Ignorable="w14 w15 w16se w16cid w16 w16cex w16sdtdh w16sdtfl w16du wp14">
-  <w15:commentEx w15:paraId="17926B5C" w15:done="0"/>
-  <w15:commentEx w15:paraId="03A06A3F" w15:paraIdParent="17926B5C" w15:done="0"/>
-  <w15:commentEx w15:paraId="78FD6BCF" w15:paraIdParent="17926B5C" w15:done="0"/>
-  <w15:commentEx w15:paraId="3DC947B9" w15:paraIdParent="17926B5C" w15:done="0"/>
-  <w15:commentEx w15:paraId="7C89C161" w15:done="0"/>
-  <w15:commentEx w15:paraId="3A9725F1" w15:done="0"/>
-  <w15:commentEx w15:paraId="1EFA95EE" w15:paraIdParent="3A9725F1" w15:done="0"/>
-  <w15:commentEx w15:paraId="535CA384" w15:done="0"/>
-  <w15:commentEx w15:paraId="0638B70B" w15:done="0"/>
-  <w15:commentEx w15:paraId="0F0C1141" w15:paraIdParent="0638B70B" w15:done="0"/>
-  <w15:commentEx w15:paraId="5D3DAE1E" w15:paraIdParent="0638B70B" w15:done="0"/>
-  <w15:commentEx w15:paraId="0EF176D0" w15:done="0"/>
-  <w15:commentEx w15:paraId="4019DEEE" w15:done="0"/>
-  <w15:commentEx w15:paraId="1F079CDA" w15:done="0"/>
-  <w15:commentEx w15:paraId="6FBFCEBC" w15:paraIdParent="1F079CDA" w15:done="0"/>
+  <w15:commentEx w15:paraId="17926B5C" w15:done="1"/>
+  <w15:commentEx w15:paraId="03A06A3F" w15:paraIdParent="17926B5C" w15:done="1"/>
+  <w15:commentEx w15:paraId="78FD6BCF" w15:paraIdParent="17926B5C" w15:done="1"/>
+  <w15:commentEx w15:paraId="3DC947B9" w15:paraIdParent="17926B5C" w15:done="1"/>
+  <w15:commentEx w15:paraId="7C89C161" w15:done="1"/>
+  <w15:commentEx w15:paraId="3A9725F1" w15:done="1"/>
+  <w15:commentEx w15:paraId="1EFA95EE" w15:paraIdParent="3A9725F1" w15:done="1"/>
+  <w15:commentEx w15:paraId="535CA384" w15:done="1"/>
+  <w15:commentEx w15:paraId="0638B70B" w15:done="1"/>
+  <w15:commentEx w15:paraId="0F0C1141" w15:paraIdParent="0638B70B" w15:done="1"/>
+  <w15:commentEx w15:paraId="5D3DAE1E" w15:paraIdParent="0638B70B" w15:done="1"/>
+  <w15:commentEx w15:paraId="0EF176D0" w15:done="1"/>
   <w15:commentEx w15:paraId="238EF83C" w15:done="0"/>
-  <w15:commentEx w15:paraId="171F7AAF" w15:done="0"/>
-  <w15:commentEx w15:paraId="2A017460" w15:done="0"/>
-  <w15:commentEx w15:paraId="5D3E88B1" w15:paraIdParent="2A017460" w15:done="0"/>
-  <w15:commentEx w15:paraId="47EC60A0" w15:done="0"/>
+  <w15:commentEx w15:paraId="2A017460" w15:done="1"/>
+  <w15:commentEx w15:paraId="5D3E88B1" w15:paraIdParent="2A017460" w15:done="1"/>
+  <w15:commentEx w15:paraId="47EC60A0" w15:done="1"/>
   <w15:commentEx w15:paraId="4AFF131D" w15:done="0"/>
   <w15:commentEx w15:paraId="0A5BD6F2" w15:paraIdParent="4AFF131D" w15:done="0"/>
-  <w15:commentEx w15:paraId="114ADCDB" w15:done="0"/>
-  <w15:commentEx w15:paraId="140A0821" w15:done="0"/>
-  <w15:commentEx w15:paraId="603391EA" w15:done="0"/>
-  <w15:commentEx w15:paraId="7F61E246" w15:done="0"/>
-  <w15:commentEx w15:paraId="22B2B5FC" w15:paraIdParent="7F61E246" w15:done="0"/>
-  <w15:commentEx w15:paraId="72E51D2C" w15:done="0"/>
-  <w15:commentEx w15:paraId="351F04B5" w15:paraIdParent="72E51D2C" w15:done="0"/>
-  <w15:commentEx w15:paraId="7B6F71F6" w15:done="0"/>
+  <w15:commentEx w15:paraId="140A0821" w15:done="1"/>
+  <w15:commentEx w15:paraId="603391EA" w15:done="1"/>
+  <w15:commentEx w15:paraId="7F61E246" w15:done="1"/>
+  <w15:commentEx w15:paraId="22B2B5FC" w15:paraIdParent="7F61E246" w15:done="1"/>
+  <w15:commentEx w15:paraId="72E51D2C" w15:done="1"/>
+  <w15:commentEx w15:paraId="351F04B5" w15:paraIdParent="72E51D2C" w15:done="1"/>
+  <w15:commentEx w15:paraId="7B6F71F6" w15:done="1"/>
 </w15:commentsEx>
 </file>
 
@@ -4326,14 +3468,11 @@
   <w16cex:commentExtensible w16cex:durableId="19B17442" w16cex:dateUtc="2025-11-27T06:50:00Z"/>
   <w16cex:commentExtensible w16cex:durableId="131EC644" w16cex:dateUtc="2025-12-05T21:43:00Z"/>
   <w16cex:commentExtensible w16cex:durableId="1898F8F5" w16cex:dateUtc="2025-11-26T23:52:00Z"/>
-  <w16cex:commentExtensible w16cex:durableId="273CFB31" w16cex:dateUtc="2025-11-22T04:44:00Z"/>
-  <w16cex:commentExtensible w16cex:durableId="41100969" w16cex:dateUtc="2025-11-27T00:01:00Z"/>
   <w16cex:commentExtensible w16cex:durableId="56F0BB08" w16cex:dateUtc="2025-11-11T17:46:00Z"/>
   <w16cex:commentExtensible w16cex:durableId="4C4F9313" w16cex:dateUtc="2025-11-11T15:51:00Z"/>
   <w16cex:commentExtensible w16cex:durableId="7B8A15D9" w16cex:dateUtc="2025-11-11T15:56:00Z"/>
   <w16cex:commentExtensible w16cex:durableId="64A2A3A3" w16cex:dateUtc="2025-11-11T15:58:00Z"/>
   <w16cex:commentExtensible w16cex:durableId="7A868877" w16cex:dateUtc="2025-11-11T16:33:00Z"/>
-  <w16cex:commentExtensible w16cex:durableId="5AB649CB" w16cex:dateUtc="2025-11-22T04:59:00Z"/>
   <w16cex:commentExtensible w16cex:durableId="2F41ACC8" w16cex:dateUtc="2025-11-27T00:13:00Z"/>
   <w16cex:commentExtensible w16cex:durableId="27B3CA15" w16cex:dateUtc="2025-11-11T16:43:00Z"/>
   <w16cex:commentExtensible w16cex:durableId="6A421D1C" w16cex:dateUtc="2025-11-11T16:50:00Z"/>
@@ -4358,17 +3497,12 @@
   <w16cid:commentId w16cid:paraId="0F0C1141" w16cid:durableId="19B17442"/>
   <w16cid:commentId w16cid:paraId="5D3DAE1E" w16cid:durableId="131EC644"/>
   <w16cid:commentId w16cid:paraId="0EF176D0" w16cid:durableId="1898F8F5"/>
-  <w16cid:commentId w16cid:paraId="4019DEEE" w16cid:durableId="2CD814DC"/>
-  <w16cid:commentId w16cid:paraId="1F079CDA" w16cid:durableId="273CFB31"/>
-  <w16cid:commentId w16cid:paraId="6FBFCEBC" w16cid:durableId="41100969"/>
   <w16cid:commentId w16cid:paraId="238EF83C" w16cid:durableId="56F0BB08"/>
-  <w16cid:commentId w16cid:paraId="171F7AAF" w16cid:durableId="2CD81657"/>
   <w16cid:commentId w16cid:paraId="2A017460" w16cid:durableId="4C4F9313"/>
   <w16cid:commentId w16cid:paraId="5D3E88B1" w16cid:durableId="2CD81684"/>
   <w16cid:commentId w16cid:paraId="47EC60A0" w16cid:durableId="7B8A15D9"/>
   <w16cid:commentId w16cid:paraId="4AFF131D" w16cid:durableId="64A2A3A3"/>
   <w16cid:commentId w16cid:paraId="0A5BD6F2" w16cid:durableId="7A868877"/>
-  <w16cid:commentId w16cid:paraId="114ADCDB" w16cid:durableId="5AB649CB"/>
   <w16cid:commentId w16cid:paraId="140A0821" w16cid:durableId="2F41ACC8"/>
   <w16cid:commentId w16cid:paraId="603391EA" w16cid:durableId="27B3CA15"/>
   <w16cid:commentId w16cid:paraId="7F61E246" w16cid:durableId="6A421D1C"/>

</xml_diff>